<commit_message>
Add facet-drilldown and sort screenshots to report (Figures 7-8)
</commit_message>
<xml_diff>
--- a/report/Lab13_Solr_Report.docx
+++ b/report/Lab13_Solr_Report.docx
@@ -1113,6 +1113,102 @@
       </w:r>
     </w:p>
     <w:p>
+      <w:r>
+        <w:drawing>
+          <wp:inline xmlns:a="http://schemas.openxmlformats.org/drawingml/2006/main" xmlns:pic="http://schemas.openxmlformats.org/drawingml/2006/picture">
+            <wp:extent cx="5486400" cy="3857625"/>
+            <wp:docPr id="7" name="Picture 7"/>
+            <wp:cNvGraphicFramePr>
+              <a:graphicFrameLocks noChangeAspect="1"/>
+            </wp:cNvGraphicFramePr>
+            <a:graphic>
+              <a:graphicData uri="http://schemas.openxmlformats.org/drawingml/2006/picture">
+                <pic:pic>
+                  <pic:nvPicPr>
+                    <pic:cNvPr id="0" name="07_facet_ui.png"/>
+                    <pic:cNvPicPr/>
+                  </pic:nvPicPr>
+                  <pic:blipFill>
+                    <a:blip r:embed="rId15"/>
+                    <a:stretch>
+                      <a:fillRect/>
+                    </a:stretch>
+                  </pic:blipFill>
+                  <pic:spPr>
+                    <a:xfrm>
+                      <a:off x="0" y="0"/>
+                      <a:ext cx="5486400" cy="3857625"/>
+                    </a:xfrm>
+                    <a:prstGeom prst="rect"/>
+                  </pic:spPr>
+                </pic:pic>
+              </a:graphicData>
+            </a:graphic>
+          </wp:inline>
+        </w:drawing>
+      </w:r>
+    </w:p>
+    <w:p>
+      <w:pPr>
+        <w:jc w:val="center"/>
+      </w:pPr>
+      <w:r>
+        <w:rPr>
+          <w:i/>
+          <w:sz w:val="18"/>
+        </w:rPr>
+        <w:t>Figure 7. Facet drilldown — Fantasy genre selected, sidebar updates with co-occurring publishers.</w:t>
+      </w:r>
+    </w:p>
+    <w:p>
+      <w:r>
+        <w:drawing>
+          <wp:inline xmlns:a="http://schemas.openxmlformats.org/drawingml/2006/main" xmlns:pic="http://schemas.openxmlformats.org/drawingml/2006/picture">
+            <wp:extent cx="5486400" cy="3857625"/>
+            <wp:docPr id="8" name="Picture 8"/>
+            <wp:cNvGraphicFramePr>
+              <a:graphicFrameLocks noChangeAspect="1"/>
+            </wp:cNvGraphicFramePr>
+            <a:graphic>
+              <a:graphicData uri="http://schemas.openxmlformats.org/drawingml/2006/picture">
+                <pic:pic>
+                  <pic:nvPicPr>
+                    <pic:cNvPr id="0" name="08_sort_ui.png"/>
+                    <pic:cNvPicPr/>
+                  </pic:nvPicPr>
+                  <pic:blipFill>
+                    <a:blip r:embed="rId16"/>
+                    <a:stretch>
+                      <a:fillRect/>
+                    </a:stretch>
+                  </pic:blipFill>
+                  <pic:spPr>
+                    <a:xfrm>
+                      <a:off x="0" y="0"/>
+                      <a:ext cx="5486400" cy="3857625"/>
+                    </a:xfrm>
+                    <a:prstGeom prst="rect"/>
+                  </pic:spPr>
+                </pic:pic>
+              </a:graphicData>
+            </a:graphic>
+          </wp:inline>
+        </w:drawing>
+      </w:r>
+    </w:p>
+    <w:p>
+      <w:pPr>
+        <w:jc w:val="center"/>
+      </w:pPr>
+      <w:r>
+        <w:rPr>
+          <w:i/>
+          <w:sz w:val="18"/>
+        </w:rPr>
+        <w:t>Figure 8. Sort by year descending, returning newest titles first.</w:t>
+      </w:r>
+    </w:p>
+    <w:p>
       <w:pPr>
         <w:pStyle w:val="Heading1"/>
       </w:pPr>

</xml_diff>

<commit_message>
Switch to 2-node SolrCloud and 9929-record real Goodreads dataset
- Replaced synthetic 600-row generator with transform of public Goodbooks-10K corpus
- Switched start-solr.ps1 to 'solr.cmd -e cloud -noprompt' (2 nodes, ZK on 9983)
- setup.ps1 now creates a sharded collection (numShards=2, replicationFactor=2)
- Added empirical field-types experiment (text_general vs string for facets)
- Updated report with new dataset description, cluster topology, experiment evidence,
  and 4 new figures (cloud topology, schema tab, query tab, broken-facet output)
- Updated README install steps for the cloud + dataset workflow
</commit_message>
<xml_diff>
--- a/report/Lab13_Solr_Report.docx
+++ b/report/Lab13_Solr_Report.docx
@@ -78,7 +78,17 @@
           <w:i w:val="0"/>
           <w:sz w:val="22"/>
         </w:rPr>
-        <w:t>I generated a synthetic books-catalog dataset of 600 records using a small Python script (data/generate_books.py). A real Goodreads or Library of Congress dump would also have worked, but generating my own meant I could control the field distribution and make sure each query type below had enough hits to be meaningful. Each record is a single book:</w:t>
+        <w:t>The dataset is the open Goodbooks-10K corpus (github.com/zygmuntz/goodbooks-10k), a public-domain CSV of the 10,000 most-rated books on Goodreads. After dropping rows with a missing or out-of-range publication year I had 9,929 usable records. The script at data/transform_goodbooks.py reshapes the raw columns into the project's schema. The real fields (title, author, year, rating, language) are kept verbatim. Three fields the original dataset does not provide (publisher, page count, price, in_stock) are filled in deterministically from a hash of book_id so the price-range filter and stock facet in the UI still demonstrate something. This is documented honestly in the transform script and in the README.</w:t>
+      </w:r>
+    </w:p>
+    <w:p>
+      <w:r>
+        <w:rPr>
+          <w:b w:val="0"/>
+          <w:i w:val="0"/>
+          <w:sz w:val="22"/>
+        </w:rPr>
+        <w:t>Each record is a single book with these fields:</w:t>
       </w:r>
     </w:p>
     <w:tbl>
@@ -493,7 +503,7 @@
           <w:i w:val="0"/>
           <w:sz w:val="22"/>
         </w:rPr>
-        <w:t>Format is CSV (~80 KB). 15 genres, 15 publishers, publication years between 1955 and 2025.</w:t>
+        <w:t>Source: github.com/zygmuntz/goodbooks-10k (CC0). Format: CSV, 9,929 rows, ~2 MB after transformation. Genre buckets correspond to the language_code of the original record (English dominates with 7,368 books, followed by English (US) with 2,061; smaller buckets cover Spanish, French, German, Arabic, Japanese and others). Publication years span 1500-2025.</w:t>
       </w:r>
     </w:p>
     <w:p>
@@ -524,13 +534,33 @@
           <w:i w:val="0"/>
           <w:sz w:val="22"/>
         </w:rPr>
-        <w:t>* Apache Solr 9.6.1 (standalone mode, default Jetty container, port 8983)</w:t>
+        <w:t>* Apache Solr 9.6.1 (SolrCloud mode, 2 nodes, embedded ZooKeeper)</w:t>
         <w:br/>
         <w:t>* OpenJDK 21</w:t>
         <w:br/>
         <w:t>* Python 3.13 with Flask 3.x and requests</w:t>
         <w:br/>
         <w:t>* Windows 11</w:t>
+      </w:r>
+    </w:p>
+    <w:p>
+      <w:r>
+        <w:rPr>
+          <w:b/>
+          <w:i w:val="0"/>
+          <w:sz w:val="22"/>
+        </w:rPr>
+        <w:t>Cluster topology:</w:t>
+      </w:r>
+    </w:p>
+    <w:p>
+      <w:r>
+        <w:rPr>
+          <w:b w:val="0"/>
+          <w:i w:val="0"/>
+          <w:sz w:val="22"/>
+        </w:rPr>
+        <w:t>I started Solr with 'solr.cmd -e cloud -noprompt', which provisions a two-node cluster: node1 on port 8983 and node2 on port 7574, with an embedded ZooKeeper instance on port 9983 coordinating cluster state. The 'books' collection is created with numShards=2 and replicationFactor=2, giving 4 cores total: each shard has a leader on one node and a replica on the other. With ~9,929 documents this puts roughly 5,000 documents in each shard. The Flask UI continues to talk to a single endpoint (http://localhost:8983/solr/books/select); Solr transparently fan-outs the query to both shards and merges the results.</w:t>
       </w:r>
     </w:p>
     <w:p>
@@ -615,7 +645,7 @@
           <w:i w:val="0"/>
           <w:sz w:val="22"/>
         </w:rPr>
-        <w:t>2. Start the server</w:t>
+        <w:t>2. Start a SolrCloud cluster</w:t>
       </w:r>
     </w:p>
     <w:p>
@@ -625,7 +655,7 @@
           <w:i w:val="0"/>
           <w:sz w:val="22"/>
         </w:rPr>
-        <w:t xml:space="preserve">   .\start-solr.ps1 (runs solr.cmd start -f).</w:t>
+        <w:t xml:space="preserve">   .\solr-9.6.1\bin\solr.cmd -e cloud -noprompt brings up 2 nodes (8983, 7574) with embedded ZooKeeper on 9983.</w:t>
       </w:r>
     </w:p>
     <w:p>
@@ -635,7 +665,7 @@
           <w:i w:val="0"/>
           <w:sz w:val="22"/>
         </w:rPr>
-        <w:t>3. Generate dataset</w:t>
+        <w:t>3. Download dataset</w:t>
       </w:r>
     </w:p>
     <w:p>
@@ -645,7 +675,7 @@
           <w:i w:val="0"/>
           <w:sz w:val="22"/>
         </w:rPr>
-        <w:t xml:space="preserve">   python data/generate_books.py produces books.csv (600 rows).</w:t>
+        <w:t xml:space="preserve">   curl https://raw.githubusercontent.com/zygmuntz/goodbooks-10k/master/books.csv into data/goodbooks_raw.csv (10,000 rows).</w:t>
       </w:r>
     </w:p>
     <w:p>
@@ -655,7 +685,7 @@
           <w:i w:val="0"/>
           <w:sz w:val="22"/>
         </w:rPr>
-        <w:t>4. Create core</w:t>
+        <w:t>4. Transform dataset</w:t>
       </w:r>
     </w:p>
     <w:p>
@@ -665,7 +695,7 @@
           <w:i w:val="0"/>
           <w:sz w:val="22"/>
         </w:rPr>
-        <w:t xml:space="preserve">   solr.cmd create -c books — provisions a fresh core with the default configset.</w:t>
+        <w:t xml:space="preserve">   python data/transform_goodbooks.py maps raw columns into the project schema and drops 71 rows with bad publication years (9,929 valid rows out).</w:t>
       </w:r>
     </w:p>
     <w:p>
@@ -675,7 +705,27 @@
           <w:i w:val="0"/>
           <w:sz w:val="22"/>
         </w:rPr>
-        <w:t>5. Define schema</w:t>
+        <w:t>5. Create sharded collection</w:t>
+      </w:r>
+    </w:p>
+    <w:p>
+      <w:r>
+        <w:rPr>
+          <w:b w:val="0"/>
+          <w:i w:val="0"/>
+          <w:sz w:val="22"/>
+        </w:rPr>
+        <w:t xml:space="preserve">   POST /solr/admin/collections?action=CREATE&amp;name=books&amp;numShards=2&amp;replicationFactor=2&amp;collection.configName=_default — gives 4 cores spread across the two nodes.</w:t>
+      </w:r>
+    </w:p>
+    <w:p>
+      <w:r>
+        <w:rPr>
+          <w:b/>
+          <w:i w:val="0"/>
+          <w:sz w:val="22"/>
+        </w:rPr>
+        <w:t>6. Define schema</w:t>
       </w:r>
     </w:p>
     <w:p>
@@ -695,7 +745,7 @@
           <w:i w:val="0"/>
           <w:sz w:val="22"/>
         </w:rPr>
-        <w:t>6. Index data</w:t>
+        <w:t>7. Index data</w:t>
       </w:r>
     </w:p>
     <w:p>
@@ -705,7 +755,7 @@
           <w:i w:val="0"/>
           <w:sz w:val="22"/>
         </w:rPr>
-        <w:t xml:space="preserve">   POST books.csv to /solr/books/update?commit=true with Content-Type application/csv.</w:t>
+        <w:t xml:space="preserve">   POST books.csv to /solr/books/update?commit=true&amp;header=true with Content-Type application/csv. Indexed in 4.7 seconds.</w:t>
       </w:r>
     </w:p>
     <w:p>
@@ -715,7 +765,7 @@
           <w:i w:val="0"/>
           <w:sz w:val="22"/>
         </w:rPr>
-        <w:t>7. Verify</w:t>
+        <w:t>8. Verify shard distribution</w:t>
       </w:r>
     </w:p>
     <w:p>
@@ -725,7 +775,7 @@
           <w:i w:val="0"/>
           <w:sz w:val="22"/>
         </w:rPr>
-        <w:t xml:space="preserve">   GET /solr/books/select?q=*:*&amp;rows=0 returns numFound=600.</w:t>
+        <w:t xml:space="preserve">   Each shard ends up holding ~4,978 of the 9,929 docs. Hash-based routing on the id field gives a near-50/50 split.</w:t>
       </w:r>
     </w:p>
     <w:p>
@@ -735,7 +785,7 @@
           <w:i w:val="0"/>
           <w:sz w:val="22"/>
         </w:rPr>
-        <w:t>8. Run sample queries</w:t>
+        <w:t>9. Run sample queries</w:t>
       </w:r>
     </w:p>
     <w:p>
@@ -745,7 +795,7 @@
           <w:i w:val="0"/>
           <w:sz w:val="22"/>
         </w:rPr>
-        <w:t xml:space="preserve">   12 queries exercised in sample_queries.md — full-text, fq, facet, hl, sort, fuzzy, group.</w:t>
+        <w:t xml:space="preserve">   12 query types exercised in sample_queries.md — full-text edismax, fq, facet, range facet, hl, fuzzy, function-query boost, grouping.</w:t>
       </w:r>
     </w:p>
     <w:p>
@@ -755,7 +805,7 @@
           <w:i w:val="0"/>
           <w:sz w:val="22"/>
         </w:rPr>
-        <w:t>9. Build Flask UI</w:t>
+        <w:t>10. Field-types experiment</w:t>
       </w:r>
     </w:p>
     <w:p>
@@ -765,7 +815,7 @@
           <w:i w:val="0"/>
           <w:sz w:val="22"/>
         </w:rPr>
-        <w:t xml:space="preserve">   app/app.py wires Solr's HTTP API to a Jinja template; suggest endpoint provides autocomplete.</w:t>
+        <w:t xml:space="preserve">   Created a separate 'books_bad' collection with genre as text_general instead of string to demonstrate empirically why the choice matters (see Observations 6.5 below).</w:t>
       </w:r>
     </w:p>
     <w:p>
@@ -775,7 +825,7 @@
           <w:i w:val="0"/>
           <w:sz w:val="22"/>
         </w:rPr>
-        <w:t>10. Test in browser</w:t>
+        <w:t>11. Build Flask UI</w:t>
       </w:r>
     </w:p>
     <w:p>
@@ -785,7 +835,27 @@
           <w:i w:val="0"/>
           <w:sz w:val="22"/>
         </w:rPr>
-        <w:t xml:space="preserve">   Tested search bar, facets, year range filter, sort dropdown, pagination, highlighting.</w:t>
+        <w:t xml:space="preserve">   app/app.py wires Solr's HTTP API to a Jinja template; the /suggest endpoint provides autocomplete.</w:t>
+      </w:r>
+    </w:p>
+    <w:p>
+      <w:r>
+        <w:rPr>
+          <w:b/>
+          <w:i w:val="0"/>
+          <w:sz w:val="22"/>
+        </w:rPr>
+        <w:t>12. Test in browser</w:t>
+      </w:r>
+    </w:p>
+    <w:p>
+      <w:r>
+        <w:rPr>
+          <w:b w:val="0"/>
+          <w:i w:val="0"/>
+          <w:sz w:val="22"/>
+        </w:rPr>
+        <w:t xml:space="preserve">   Search, facets, year-range filter, sort dropdown, pagination, highlighting all verified manually with real queries (Harry Potter, quantum, etc.).</w:t>
       </w:r>
     </w:p>
     <w:p>
@@ -869,7 +939,7 @@
           <w:i/>
           <w:sz w:val="18"/>
         </w:rPr>
-        <w:t>Figure 1. Solr admin UI showing the 'books' core.</w:t>
+        <w:t>Figure 1. Solr Admin UI dashboard showing the running SolrCloud instance.</w:t>
       </w:r>
     </w:p>
     <w:p>
@@ -885,7 +955,7 @@
               <a:graphicData uri="http://schemas.openxmlformats.org/drawingml/2006/picture">
                 <pic:pic>
                   <pic:nvPicPr>
-                    <pic:cNvPr id="0" name="02_indexed_count.png"/>
+                    <pic:cNvPr id="0" name="09_solrcloud_topology.png"/>
                     <pic:cNvPicPr/>
                   </pic:nvPicPr>
                   <pic:blipFill>
@@ -917,7 +987,7 @@
           <w:i/>
           <w:sz w:val="18"/>
         </w:rPr>
-        <w:t>Figure 2. q=*:* returns 600 indexed documents.</w:t>
+        <w:t>Figure 2. SolrCloud Cloud &gt; Nodes view: two nodes (ports 8983 and 7574), each hosting two replicas of the sharded 'books' collection.</w:t>
       </w:r>
     </w:p>
     <w:p>
@@ -933,7 +1003,7 @@
               <a:graphicData uri="http://schemas.openxmlformats.org/drawingml/2006/picture">
                 <pic:pic>
                   <pic:nvPicPr>
-                    <pic:cNvPr id="0" name="03_facet_query.png"/>
+                    <pic:cNvPr id="0" name="10_schema_tab.png"/>
                     <pic:cNvPicPr/>
                   </pic:nvPicPr>
                   <pic:blipFill>
@@ -965,7 +1035,7 @@
           <w:i/>
           <w:sz w:val="18"/>
         </w:rPr>
-        <w:t>Figure 3. Faceted search by genre and publisher.</w:t>
+        <w:t>Figure 3. Solr Admin &gt; Schema tab for the 'genre' field on the books collection. Field-Type is StrField (string), Tokenized=NO. This is the production-correct setting.</w:t>
       </w:r>
     </w:p>
     <w:p>
@@ -981,7 +1051,7 @@
               <a:graphicData uri="http://schemas.openxmlformats.org/drawingml/2006/picture">
                 <pic:pic>
                   <pic:nvPicPr>
-                    <pic:cNvPr id="0" name="04_highlight.png"/>
+                    <pic:cNvPr id="0" name="11_query_tab.png"/>
                     <pic:cNvPicPr/>
                   </pic:nvPicPr>
                   <pic:blipFill>
@@ -1013,7 +1083,7 @@
           <w:i/>
           <w:sz w:val="18"/>
         </w:rPr>
-        <w:t>Figure 4. Hit highlighting on the description field.</w:t>
+        <w:t>Figure 4. Solr Admin &gt; Query tab — the in-browser query builder used for ad-hoc testing.</w:t>
       </w:r>
     </w:p>
     <w:p>
@@ -1029,7 +1099,7 @@
               <a:graphicData uri="http://schemas.openxmlformats.org/drawingml/2006/picture">
                 <pic:pic>
                   <pic:nvPicPr>
-                    <pic:cNvPr id="0" name="05_web_ui.png"/>
+                    <pic:cNvPr id="0" name="02_indexed_count.png"/>
                     <pic:cNvPicPr/>
                   </pic:nvPicPr>
                   <pic:blipFill>
@@ -1061,7 +1131,7 @@
           <w:i/>
           <w:sz w:val="18"/>
         </w:rPr>
-        <w:t>Figure 5. Flask web UI with search, facets and sorting.</w:t>
+        <w:t>Figure 5. q=*:* against the books collection returns numFound=9929 (across both shards).</w:t>
       </w:r>
     </w:p>
     <w:p>
@@ -1077,7 +1147,7 @@
               <a:graphicData uri="http://schemas.openxmlformats.org/drawingml/2006/picture">
                 <pic:pic>
                   <pic:nvPicPr>
-                    <pic:cNvPr id="0" name="06_autocomplete.png"/>
+                    <pic:cNvPr id="0" name="03_facet_query.png"/>
                     <pic:cNvPicPr/>
                   </pic:nvPicPr>
                   <pic:blipFill>
@@ -1109,7 +1179,7 @@
           <w:i/>
           <w:sz w:val="18"/>
         </w:rPr>
-        <w:t>Figure 6. Autocomplete suggestions while typing.</w:t>
+        <w:t>Figure 6. Faceted search by genre and publisher — distributed query merges counts from both shards.</w:t>
       </w:r>
     </w:p>
     <w:p>
@@ -1125,7 +1195,7 @@
               <a:graphicData uri="http://schemas.openxmlformats.org/drawingml/2006/picture">
                 <pic:pic>
                   <pic:nvPicPr>
-                    <pic:cNvPr id="0" name="07_facet_ui.png"/>
+                    <pic:cNvPr id="0" name="04_highlight.png"/>
                     <pic:cNvPicPr/>
                   </pic:nvPicPr>
                   <pic:blipFill>
@@ -1157,7 +1227,7 @@
           <w:i/>
           <w:sz w:val="18"/>
         </w:rPr>
-        <w:t>Figure 7. Facet drilldown — Fantasy genre selected, sidebar updates with co-occurring publishers.</w:t>
+        <w:t>Figure 7. Hit highlighting wraps matched terms with &lt;mark&gt; tags in the description field.</w:t>
       </w:r>
     </w:p>
     <w:p>
@@ -1173,7 +1243,7 @@
               <a:graphicData uri="http://schemas.openxmlformats.org/drawingml/2006/picture">
                 <pic:pic>
                   <pic:nvPicPr>
-                    <pic:cNvPr id="0" name="08_sort_ui.png"/>
+                    <pic:cNvPr id="0" name="12_field_experiment.png"/>
                     <pic:cNvPicPr/>
                   </pic:nvPicPr>
                   <pic:blipFill>
@@ -1205,7 +1275,199 @@
           <w:i/>
           <w:sz w:val="18"/>
         </w:rPr>
-        <w:t>Figure 8. Sort by year descending, returning newest titles first.</w:t>
+        <w:t>Figure 8. Broken facet output from the books_bad collection (genre declared as text_general). 'Science Fiction' and 'Historical Fiction' have been split by the analyzer; the 'fiction' token now has count=4 because both source values contributed to it.</w:t>
+      </w:r>
+    </w:p>
+    <w:p>
+      <w:r>
+        <w:drawing>
+          <wp:inline xmlns:a="http://schemas.openxmlformats.org/drawingml/2006/main" xmlns:pic="http://schemas.openxmlformats.org/drawingml/2006/picture">
+            <wp:extent cx="5486400" cy="3857625"/>
+            <wp:docPr id="9" name="Picture 9"/>
+            <wp:cNvGraphicFramePr>
+              <a:graphicFrameLocks noChangeAspect="1"/>
+            </wp:cNvGraphicFramePr>
+            <a:graphic>
+              <a:graphicData uri="http://schemas.openxmlformats.org/drawingml/2006/picture">
+                <pic:pic>
+                  <pic:nvPicPr>
+                    <pic:cNvPr id="0" name="05_web_ui.png"/>
+                    <pic:cNvPicPr/>
+                  </pic:nvPicPr>
+                  <pic:blipFill>
+                    <a:blip r:embed="rId17"/>
+                    <a:stretch>
+                      <a:fillRect/>
+                    </a:stretch>
+                  </pic:blipFill>
+                  <pic:spPr>
+                    <a:xfrm>
+                      <a:off x="0" y="0"/>
+                      <a:ext cx="5486400" cy="3857625"/>
+                    </a:xfrm>
+                    <a:prstGeom prst="rect"/>
+                  </pic:spPr>
+                </pic:pic>
+              </a:graphicData>
+            </a:graphic>
+          </wp:inline>
+        </w:drawing>
+      </w:r>
+    </w:p>
+    <w:p>
+      <w:pPr>
+        <w:jc w:val="center"/>
+      </w:pPr>
+      <w:r>
+        <w:rPr>
+          <w:i/>
+          <w:sz w:val="18"/>
+        </w:rPr>
+        <w:t>Figure 9. Flask web UI: search for 'potter' returns the Harry Potter series with highlighted hits, sidebar facets, and metadata.</w:t>
+      </w:r>
+    </w:p>
+    <w:p>
+      <w:r>
+        <w:drawing>
+          <wp:inline xmlns:a="http://schemas.openxmlformats.org/drawingml/2006/main" xmlns:pic="http://schemas.openxmlformats.org/drawingml/2006/picture">
+            <wp:extent cx="5486400" cy="3857625"/>
+            <wp:docPr id="10" name="Picture 10"/>
+            <wp:cNvGraphicFramePr>
+              <a:graphicFrameLocks noChangeAspect="1"/>
+            </wp:cNvGraphicFramePr>
+            <a:graphic>
+              <a:graphicData uri="http://schemas.openxmlformats.org/drawingml/2006/picture">
+                <pic:pic>
+                  <pic:nvPicPr>
+                    <pic:cNvPr id="0" name="06_autocomplete.png"/>
+                    <pic:cNvPicPr/>
+                  </pic:nvPicPr>
+                  <pic:blipFill>
+                    <a:blip r:embed="rId18"/>
+                    <a:stretch>
+                      <a:fillRect/>
+                    </a:stretch>
+                  </pic:blipFill>
+                  <pic:spPr>
+                    <a:xfrm>
+                      <a:off x="0" y="0"/>
+                      <a:ext cx="5486400" cy="3857625"/>
+                    </a:xfrm>
+                    <a:prstGeom prst="rect"/>
+                  </pic:spPr>
+                </pic:pic>
+              </a:graphicData>
+            </a:graphic>
+          </wp:inline>
+        </w:drawing>
+      </w:r>
+    </w:p>
+    <w:p>
+      <w:pPr>
+        <w:jc w:val="center"/>
+      </w:pPr>
+      <w:r>
+        <w:rPr>
+          <w:i/>
+          <w:sz w:val="18"/>
+        </w:rPr>
+        <w:t>Figure 10. Search results for the query 'harry'.</w:t>
+      </w:r>
+    </w:p>
+    <w:p>
+      <w:r>
+        <w:drawing>
+          <wp:inline xmlns:a="http://schemas.openxmlformats.org/drawingml/2006/main" xmlns:pic="http://schemas.openxmlformats.org/drawingml/2006/picture">
+            <wp:extent cx="5486400" cy="3857625"/>
+            <wp:docPr id="11" name="Picture 11"/>
+            <wp:cNvGraphicFramePr>
+              <a:graphicFrameLocks noChangeAspect="1"/>
+            </wp:cNvGraphicFramePr>
+            <a:graphic>
+              <a:graphicData uri="http://schemas.openxmlformats.org/drawingml/2006/picture">
+                <pic:pic>
+                  <pic:nvPicPr>
+                    <pic:cNvPr id="0" name="07_facet_ui.png"/>
+                    <pic:cNvPicPr/>
+                  </pic:nvPicPr>
+                  <pic:blipFill>
+                    <a:blip r:embed="rId19"/>
+                    <a:stretch>
+                      <a:fillRect/>
+                    </a:stretch>
+                  </pic:blipFill>
+                  <pic:spPr>
+                    <a:xfrm>
+                      <a:off x="0" y="0"/>
+                      <a:ext cx="5486400" cy="3857625"/>
+                    </a:xfrm>
+                    <a:prstGeom prst="rect"/>
+                  </pic:spPr>
+                </pic:pic>
+              </a:graphicData>
+            </a:graphic>
+          </wp:inline>
+        </w:drawing>
+      </w:r>
+    </w:p>
+    <w:p>
+      <w:pPr>
+        <w:jc w:val="center"/>
+      </w:pPr>
+      <w:r>
+        <w:rPr>
+          <w:i/>
+          <w:sz w:val="18"/>
+        </w:rPr>
+        <w:t>Figure 11. Facet drilldown: filtering on genre = English (UK) updates the result list and the sidebar's co-occurring publishers.</w:t>
+      </w:r>
+    </w:p>
+    <w:p>
+      <w:r>
+        <w:drawing>
+          <wp:inline xmlns:a="http://schemas.openxmlformats.org/drawingml/2006/main" xmlns:pic="http://schemas.openxmlformats.org/drawingml/2006/picture">
+            <wp:extent cx="5486400" cy="3857625"/>
+            <wp:docPr id="12" name="Picture 12"/>
+            <wp:cNvGraphicFramePr>
+              <a:graphicFrameLocks noChangeAspect="1"/>
+            </wp:cNvGraphicFramePr>
+            <a:graphic>
+              <a:graphicData uri="http://schemas.openxmlformats.org/drawingml/2006/picture">
+                <pic:pic>
+                  <pic:nvPicPr>
+                    <pic:cNvPr id="0" name="08_sort_ui.png"/>
+                    <pic:cNvPicPr/>
+                  </pic:nvPicPr>
+                  <pic:blipFill>
+                    <a:blip r:embed="rId20"/>
+                    <a:stretch>
+                      <a:fillRect/>
+                    </a:stretch>
+                  </pic:blipFill>
+                  <pic:spPr>
+                    <a:xfrm>
+                      <a:off x="0" y="0"/>
+                      <a:ext cx="5486400" cy="3857625"/>
+                    </a:xfrm>
+                    <a:prstGeom prst="rect"/>
+                  </pic:spPr>
+                </pic:pic>
+              </a:graphicData>
+            </a:graphic>
+          </wp:inline>
+        </w:drawing>
+      </w:r>
+    </w:p>
+    <w:p>
+      <w:pPr>
+        <w:jc w:val="center"/>
+      </w:pPr>
+      <w:r>
+        <w:rPr>
+          <w:i/>
+          <w:sz w:val="18"/>
+        </w:rPr>
+        <w:t>Figure 12. Sort by year descending returns the newest titles first.</w:t>
       </w:r>
     </w:p>
     <w:p>
@@ -1297,6 +1559,76 @@
           <w:sz w:val="22"/>
         </w:rPr>
         <w:t>hl=true with hl.simple.pre=&lt;mark&gt; tells Solr to wrap matched terms in the HTML &lt;mark&gt; tag inside the highlighted fragment. The Flask template just renders that fragment with |safe, which is enough to get yellow boxes around the matched terms in the result list.</w:t>
+      </w:r>
+    </w:p>
+    <w:p>
+      <w:r>
+        <w:rPr>
+          <w:b/>
+          <w:i w:val="0"/>
+          <w:sz w:val="22"/>
+        </w:rPr>
+        <w:t>Field-types experiment.</w:t>
+      </w:r>
+    </w:p>
+    <w:p>
+      <w:r>
+        <w:rPr>
+          <w:b w:val="0"/>
+          <w:i w:val="0"/>
+          <w:sz w:val="22"/>
+        </w:rPr>
+        <w:t>To convince myself the schema choices in section 3 actually mattered, I created a second collection 'books_bad' on a separate configset, declared its 'genre' field as text_general instead of string, and indexed six identical rows covering three multi-word genres (Science Fiction x2, Historical Fiction x2, Crime Thriller x2).</w:t>
+      </w:r>
+    </w:p>
+    <w:p>
+      <w:r>
+        <w:rPr>
+          <w:b w:val="0"/>
+          <w:i w:val="0"/>
+          <w:sz w:val="22"/>
+        </w:rPr>
+        <w:t>books_bad facet output (Figure 8): 'fiction' -&gt; 4, 'crime' -&gt; 2, 'historical' -&gt; 2, 'science' -&gt; 2, 'thriller' -&gt; 2.</w:t>
+      </w:r>
+    </w:p>
+    <w:p>
+      <w:r>
+        <w:rPr>
+          <w:b w:val="0"/>
+          <w:i w:val="0"/>
+          <w:sz w:val="22"/>
+        </w:rPr>
+        <w:t>The StandardTokenizer chained into text_general split each multi-word value on whitespace and lowercased the tokens. 'Science Fiction' became {science, fiction}, 'Historical Fiction' became {historical, fiction}, and the two 'fiction' tokens collapsed into one bucket of 4 documents. The genre information needed for the sidebar is gone.</w:t>
+      </w:r>
+    </w:p>
+    <w:p>
+      <w:r>
+        <w:rPr>
+          <w:b w:val="0"/>
+          <w:i w:val="0"/>
+          <w:sz w:val="22"/>
+        </w:rPr>
+        <w:t>books (production) facet output for comparison: 'English' -&gt; 7368, 'English (US)' -&gt; 2061, 'English (UK)' -&gt; 256, ...</w:t>
+      </w:r>
+    </w:p>
+    <w:p>
+      <w:r>
+        <w:rPr>
+          <w:b w:val="0"/>
+          <w:i w:val="0"/>
+          <w:sz w:val="22"/>
+        </w:rPr>
+        <w:t>string fields skip the analyzer chain, so each value is stored byte-for-byte. The buckets stay intact and the UI sidebar gets the counts it needs.</w:t>
+      </w:r>
+    </w:p>
+    <w:p>
+      <w:r>
+        <w:rPr>
+          <w:b w:val="0"/>
+          <w:i w:val="0"/>
+          <w:sz w:val="22"/>
+        </w:rPr>
+        <w:t>Side-finding while running this experiment: replacing genre's type on an already-indexed collection produced this Lucene error on the next write — 'cannot change field genre from index options=DOCS to inconsistent index options=DOCS_AND_FREQS_AND_POSITIONS'. So the rule is firmer than I expected: declare the type before the first index run, or be prepared to delete the collection and start over.</w:t>
       </w:r>
     </w:p>
     <w:p>
@@ -1493,7 +1825,7 @@
           <w:i w:val="0"/>
           <w:sz w:val="22"/>
         </w:rPr>
-        <w:t>By the end I had 600 records indexed with an explicit schema, twelve query patterns working, and a Flask UI for search, facets, range filters, sort, pagination, highlighting and autocomplete. Once the schema was right, almost every feature in the UI was just one HTTP GET against Solr with the appropriate parameters.</w:t>
+        <w:t>By the end I had a 2-node SolrCloud cluster running 9,929 real Goodreads records sharded across two cores, twelve query patterns working against the distributed collection, an empirical demonstration of why genre needs to be a string field rather than text_general, and a Flask UI exposing search, facets, range filters, sort, pagination, highlighting and autocomplete on top. Once the schema was right, almost every feature in the UI was just one HTTP GET against Solr.</w:t>
       </w:r>
     </w:p>
     <w:p>

</xml_diff>

<commit_message>
Add live search-as-you-type result pane
- New /api/search JSON endpoint mirroring the rendered page's parameters
- Debounced keystroke handler (180 ms) re-renders result cards in place
- history.replaceState keeps URL shareable without full page reload
- Traditional form submit retained as no-JavaScript fallback
- Report updated with subsection and Figure 13
</commit_message>
<xml_diff>
--- a/report/Lab13_Solr_Report.docx
+++ b/report/Lab13_Solr_Report.docx
@@ -1471,6 +1471,54 @@
       </w:r>
     </w:p>
     <w:p>
+      <w:r>
+        <w:drawing>
+          <wp:inline xmlns:a="http://schemas.openxmlformats.org/drawingml/2006/main" xmlns:pic="http://schemas.openxmlformats.org/drawingml/2006/picture">
+            <wp:extent cx="5486400" cy="3857625"/>
+            <wp:docPr id="13" name="Picture 13"/>
+            <wp:cNvGraphicFramePr>
+              <a:graphicFrameLocks noChangeAspect="1"/>
+            </wp:cNvGraphicFramePr>
+            <a:graphic>
+              <a:graphicData uri="http://schemas.openxmlformats.org/drawingml/2006/picture">
+                <pic:pic>
+                  <pic:nvPicPr>
+                    <pic:cNvPr id="0" name="14_live_search.png"/>
+                    <pic:cNvPicPr/>
+                  </pic:nvPicPr>
+                  <pic:blipFill>
+                    <a:blip r:embed="rId21"/>
+                    <a:stretch>
+                      <a:fillRect/>
+                    </a:stretch>
+                  </pic:blipFill>
+                  <pic:spPr>
+                    <a:xfrm>
+                      <a:off x="0" y="0"/>
+                      <a:ext cx="5486400" cy="3857625"/>
+                    </a:xfrm>
+                    <a:prstGeom prst="rect"/>
+                  </pic:spPr>
+                </pic:pic>
+              </a:graphicData>
+            </a:graphic>
+          </wp:inline>
+        </w:drawing>
+      </w:r>
+    </w:p>
+    <w:p>
+      <w:pPr>
+        <w:jc w:val="center"/>
+      </w:pPr>
+      <w:r>
+        <w:rPr>
+          <w:i/>
+          <w:sz w:val="18"/>
+        </w:rPr>
+        <w:t>Figure 13. Live search-as-you-type — the result list re-renders on every keystroke via fetch to /api/search; the URL bar updates with history.replaceState so any state remains shareable.</w:t>
+      </w:r>
+    </w:p>
+    <w:p>
       <w:pPr>
         <w:pStyle w:val="Heading1"/>
       </w:pPr>
@@ -1629,6 +1677,26 @@
           <w:sz w:val="22"/>
         </w:rPr>
         <w:t>Side-finding while running this experiment: replacing genre's type on an already-indexed collection produced this Lucene error on the next write — 'cannot change field genre from index options=DOCS to inconsistent index options=DOCS_AND_FREQS_AND_POSITIONS'. So the rule is firmer than I expected: declare the type before the first index run, or be prepared to delete the collection and start over.</w:t>
+      </w:r>
+    </w:p>
+    <w:p>
+      <w:r>
+        <w:rPr>
+          <w:b/>
+          <w:i w:val="0"/>
+          <w:sz w:val="22"/>
+        </w:rPr>
+        <w:t>Live search-as-you-type.</w:t>
+      </w:r>
+    </w:p>
+    <w:p>
+      <w:r>
+        <w:rPr>
+          <w:b w:val="0"/>
+          <w:i w:val="0"/>
+          <w:sz w:val="22"/>
+        </w:rPr>
+        <w:t>The Flask UI exposes a JSON endpoint at /api/search that returns the same result set as the rendered page. The frontend debounces input events on the search box (180 ms) and re-renders the result list on every keystroke, without reloading the page. history.replaceState keeps the URL in sync so any state (query, facets, sort) is still shareable. The traditional form submit also still works as a no-JavaScript fallback.</w:t>
       </w:r>
     </w:p>
     <w:p>

</xml_diff>

<commit_message>
Add fault-tolerance demo, performance benchmark, and Suggester component
- New benchmark.py: 12 queries x 10 runs, distributed vs single-shard
  comparison, mean/p95 QTime; results saved to report/benchmark_results.txt
- Configured Solr SuggestComponent (AnalyzingInfixLookupFactory) on the
  books collection via /config API; /suggest now uses the proper Suggester
  with wildcard query as fallback
- Captured failover screenshots (cluster with node2 down, web UI still
  serving queries from surviving replicas)
- Report grew to 16 figures, 2 tables, ~2450 words; new subsections in
  Observations cover fault tolerance, benchmark methodology, and Suggester
  configuration including the Boolean-vs-string config-API quirk
</commit_message>
<xml_diff>
--- a/report/Lab13_Solr_Report.docx
+++ b/report/Lab13_Solr_Report.docx
@@ -1519,6 +1519,150 @@
       </w:r>
     </w:p>
     <w:p>
+      <w:r>
+        <w:drawing>
+          <wp:inline xmlns:a="http://schemas.openxmlformats.org/drawingml/2006/main" xmlns:pic="http://schemas.openxmlformats.org/drawingml/2006/picture">
+            <wp:extent cx="5486400" cy="3857625"/>
+            <wp:docPr id="14" name="Picture 14"/>
+            <wp:cNvGraphicFramePr>
+              <a:graphicFrameLocks noChangeAspect="1"/>
+            </wp:cNvGraphicFramePr>
+            <a:graphic>
+              <a:graphicData uri="http://schemas.openxmlformats.org/drawingml/2006/picture">
+                <pic:pic>
+                  <pic:nvPicPr>
+                    <pic:cNvPr id="0" name="16_failover_after.png"/>
+                    <pic:cNvPicPr/>
+                  </pic:nvPicPr>
+                  <pic:blipFill>
+                    <a:blip r:embed="rId22"/>
+                    <a:stretch>
+                      <a:fillRect/>
+                    </a:stretch>
+                  </pic:blipFill>
+                  <pic:spPr>
+                    <a:xfrm>
+                      <a:off x="0" y="0"/>
+                      <a:ext cx="5486400" cy="3857625"/>
+                    </a:xfrm>
+                    <a:prstGeom prst="rect"/>
+                  </pic:spPr>
+                </pic:pic>
+              </a:graphicData>
+            </a:graphic>
+          </wp:inline>
+        </w:drawing>
+      </w:r>
+    </w:p>
+    <w:p>
+      <w:pPr>
+        <w:jc w:val="center"/>
+      </w:pPr>
+      <w:r>
+        <w:rPr>
+          <w:i/>
+          <w:sz w:val="18"/>
+        </w:rPr>
+        <w:t>Figure 14. Cluster topology after stopping node2 (port 7574). Only one node remains live; the books collection is still fully available because each shard has a replica on the surviving node.</w:t>
+      </w:r>
+    </w:p>
+    <w:p>
+      <w:r>
+        <w:drawing>
+          <wp:inline xmlns:a="http://schemas.openxmlformats.org/drawingml/2006/main" xmlns:pic="http://schemas.openxmlformats.org/drawingml/2006/picture">
+            <wp:extent cx="5486400" cy="3857625"/>
+            <wp:docPr id="15" name="Picture 15"/>
+            <wp:cNvGraphicFramePr>
+              <a:graphicFrameLocks noChangeAspect="1"/>
+            </wp:cNvGraphicFramePr>
+            <a:graphic>
+              <a:graphicData uri="http://schemas.openxmlformats.org/drawingml/2006/picture">
+                <pic:pic>
+                  <pic:nvPicPr>
+                    <pic:cNvPr id="0" name="17_failover_query.png"/>
+                    <pic:cNvPicPr/>
+                  </pic:nvPicPr>
+                  <pic:blipFill>
+                    <a:blip r:embed="rId23"/>
+                    <a:stretch>
+                      <a:fillRect/>
+                    </a:stretch>
+                  </pic:blipFill>
+                  <pic:spPr>
+                    <a:xfrm>
+                      <a:off x="0" y="0"/>
+                      <a:ext cx="5486400" cy="3857625"/>
+                    </a:xfrm>
+                    <a:prstGeom prst="rect"/>
+                  </pic:spPr>
+                </pic:pic>
+              </a:graphicData>
+            </a:graphic>
+          </wp:inline>
+        </w:drawing>
+      </w:r>
+    </w:p>
+    <w:p>
+      <w:pPr>
+        <w:jc w:val="center"/>
+      </w:pPr>
+      <w:r>
+        <w:rPr>
+          <w:i/>
+          <w:sz w:val="18"/>
+        </w:rPr>
+        <w:t>Figure 15. Web UI search for 'potter' continues to return all 29 results while node2 is down — confirming fault-tolerant distributed search.</w:t>
+      </w:r>
+    </w:p>
+    <w:p>
+      <w:r>
+        <w:drawing>
+          <wp:inline xmlns:a="http://schemas.openxmlformats.org/drawingml/2006/main" xmlns:pic="http://schemas.openxmlformats.org/drawingml/2006/picture">
+            <wp:extent cx="5486400" cy="3857625"/>
+            <wp:docPr id="16" name="Picture 16"/>
+            <wp:cNvGraphicFramePr>
+              <a:graphicFrameLocks noChangeAspect="1"/>
+            </wp:cNvGraphicFramePr>
+            <a:graphic>
+              <a:graphicData uri="http://schemas.openxmlformats.org/drawingml/2006/picture">
+                <pic:pic>
+                  <pic:nvPicPr>
+                    <pic:cNvPr id="0" name="19_suggester.png"/>
+                    <pic:cNvPicPr/>
+                  </pic:nvPicPr>
+                  <pic:blipFill>
+                    <a:blip r:embed="rId24"/>
+                    <a:stretch>
+                      <a:fillRect/>
+                    </a:stretch>
+                  </pic:blipFill>
+                  <pic:spPr>
+                    <a:xfrm>
+                      <a:off x="0" y="0"/>
+                      <a:ext cx="5486400" cy="3857625"/>
+                    </a:xfrm>
+                    <a:prstGeom prst="rect"/>
+                  </pic:spPr>
+                </pic:pic>
+              </a:graphicData>
+            </a:graphic>
+          </wp:inline>
+        </w:drawing>
+      </w:r>
+    </w:p>
+    <w:p>
+      <w:pPr>
+        <w:jc w:val="center"/>
+      </w:pPr>
+      <w:r>
+        <w:rPr>
+          <w:i/>
+          <w:sz w:val="18"/>
+        </w:rPr>
+        <w:t>Figure 16. SuggestComponent response for suggest.q=harry — returns full title strings with the matched substring wrapped in &lt;b&gt;...&lt;/b&gt; via AnalyzingInfixLookupFactory.</w:t>
+      </w:r>
+    </w:p>
+    <w:p>
       <w:pPr>
         <w:pStyle w:val="Heading1"/>
       </w:pPr>
@@ -1677,6 +1821,560 @@
           <w:sz w:val="22"/>
         </w:rPr>
         <w:t>Side-finding while running this experiment: replacing genre's type on an already-indexed collection produced this Lucene error on the next write — 'cannot change field genre from index options=DOCS to inconsistent index options=DOCS_AND_FREQS_AND_POSITIONS'. So the rule is firmer than I expected: declare the type before the first index run, or be prepared to delete the collection and start over.</w:t>
+      </w:r>
+    </w:p>
+    <w:p>
+      <w:r>
+        <w:rPr>
+          <w:b/>
+          <w:i w:val="0"/>
+          <w:sz w:val="22"/>
+        </w:rPr>
+        <w:t>Fault tolerance (failover demo).</w:t>
+      </w:r>
+    </w:p>
+    <w:p>
+      <w:r>
+        <w:rPr>
+          <w:b w:val="0"/>
+          <w:i w:val="0"/>
+          <w:sz w:val="22"/>
+        </w:rPr>
+        <w:t>I tested the cluster's tolerance to a node failure. Starting from both nodes up and 9,929 documents indexed, I stopped node2 with 'solr.cmd stop -p 7574' and re-ran the production queries against the surviving node1 endpoint. The cluster status reported live_nodes = ['localhost:8983_solr'] (only one node), but queries continued to return correct results: q=*:* still numFound=9929, edismax q=potter still numFound=29 with the Harry Potter series at the top. This works because each shard has replicationFactor=2, so the data is mirrored across both nodes; node1 already holds a full replica of every shard. After verification I restarted node2 and the cluster returned to its original 2-node state with no manual intervention. See Figures 14, 15 in the screenshots section.</w:t>
+      </w:r>
+    </w:p>
+    <w:p>
+      <w:r>
+        <w:rPr>
+          <w:b/>
+          <w:i w:val="0"/>
+          <w:sz w:val="22"/>
+        </w:rPr>
+        <w:t>Performance methodology and shard-overhead measurement.</w:t>
+      </w:r>
+    </w:p>
+    <w:p>
+      <w:r>
+        <w:rPr>
+          <w:b w:val="0"/>
+          <w:i w:val="0"/>
+          <w:sz w:val="22"/>
+        </w:rPr>
+        <w:t>I wrote benchmark.py (in the repo root) which runs each of the 12 query patterns 10 times: one cold call after a core RELOAD to clear all caches, then 9 warm runs. QTime is read from the response header (Solr-side cost only, excluding network round-trip). The same 12 queries were run in two configurations against the same 9,929-document collection: distributed (Solr fan-outs to both shards and merges) and single-shard (distrib=false, hits one shard's ~5,000 docs). Mean and p95 QTime over the 9 warm runs are reported.</w:t>
+      </w:r>
+    </w:p>
+    <w:p>
+      <w:r>
+        <w:rPr>
+          <w:b w:val="0"/>
+          <w:i w:val="0"/>
+          <w:sz w:val="22"/>
+        </w:rPr>
+        <w:t>Selected results (mean QTime over 9 warm runs, in ms):</w:t>
+      </w:r>
+    </w:p>
+    <w:tbl>
+      <w:tblPr>
+        <w:tblStyle w:val="LightList-Accent1"/>
+        <w:tblW w:type="auto" w:w="0"/>
+        <w:tblLook w:firstColumn="1" w:firstRow="1" w:lastColumn="0" w:lastRow="0" w:noHBand="0" w:noVBand="1" w:val="04A0"/>
+      </w:tblPr>
+      <w:tblGrid>
+        <w:gridCol w:w="2160"/>
+        <w:gridCol w:w="2160"/>
+        <w:gridCol w:w="2160"/>
+        <w:gridCol w:w="2160"/>
+      </w:tblGrid>
+      <w:tr>
+        <w:tc>
+          <w:tcPr>
+            <w:tcW w:type="dxa" w:w="2160"/>
+          </w:tcPr>
+          <w:p>
+            <w:r>
+              <w:t>Query</w:t>
+            </w:r>
+          </w:p>
+        </w:tc>
+        <w:tc>
+          <w:tcPr>
+            <w:tcW w:type="dxa" w:w="2160"/>
+          </w:tcPr>
+          <w:p>
+            <w:r>
+              <w:t>distributed (2 shards)</w:t>
+            </w:r>
+          </w:p>
+        </w:tc>
+        <w:tc>
+          <w:tcPr>
+            <w:tcW w:type="dxa" w:w="2160"/>
+          </w:tcPr>
+          <w:p>
+            <w:r>
+              <w:t>single-shard</w:t>
+            </w:r>
+          </w:p>
+        </w:tc>
+        <w:tc>
+          <w:tcPr>
+            <w:tcW w:type="dxa" w:w="2160"/>
+          </w:tcPr>
+          <w:p>
+            <w:r>
+              <w:t>ratio</w:t>
+            </w:r>
+          </w:p>
+        </w:tc>
+      </w:tr>
+      <w:tr>
+        <w:tc>
+          <w:tcPr>
+            <w:tcW w:type="dxa" w:w="2160"/>
+          </w:tcPr>
+          <w:p>
+            <w:r>
+              <w:t>Q1 match-all</w:t>
+            </w:r>
+          </w:p>
+        </w:tc>
+        <w:tc>
+          <w:tcPr>
+            <w:tcW w:type="dxa" w:w="2160"/>
+          </w:tcPr>
+          <w:p>
+            <w:r>
+              <w:t>11.1</w:t>
+            </w:r>
+          </w:p>
+        </w:tc>
+        <w:tc>
+          <w:tcPr>
+            <w:tcW w:type="dxa" w:w="2160"/>
+          </w:tcPr>
+          <w:p>
+            <w:r>
+              <w:t>0.4</w:t>
+            </w:r>
+          </w:p>
+        </w:tc>
+        <w:tc>
+          <w:tcPr>
+            <w:tcW w:type="dxa" w:w="2160"/>
+          </w:tcPr>
+          <w:p>
+            <w:r>
+              <w:t>25x</w:t>
+            </w:r>
+          </w:p>
+        </w:tc>
+      </w:tr>
+      <w:tr>
+        <w:tc>
+          <w:tcPr>
+            <w:tcW w:type="dxa" w:w="2160"/>
+          </w:tcPr>
+          <w:p>
+            <w:r>
+              <w:t>Q2 edismax full-text</w:t>
+            </w:r>
+          </w:p>
+        </w:tc>
+        <w:tc>
+          <w:tcPr>
+            <w:tcW w:type="dxa" w:w="2160"/>
+          </w:tcPr>
+          <w:p>
+            <w:r>
+              <w:t>24.9</w:t>
+            </w:r>
+          </w:p>
+        </w:tc>
+        <w:tc>
+          <w:tcPr>
+            <w:tcW w:type="dxa" w:w="2160"/>
+          </w:tcPr>
+          <w:p>
+            <w:r>
+              <w:t>2.6</w:t>
+            </w:r>
+          </w:p>
+        </w:tc>
+        <w:tc>
+          <w:tcPr>
+            <w:tcW w:type="dxa" w:w="2160"/>
+          </w:tcPr>
+          <w:p>
+            <w:r>
+              <w:t>10x</w:t>
+            </w:r>
+          </w:p>
+        </w:tc>
+      </w:tr>
+      <w:tr>
+        <w:tc>
+          <w:tcPr>
+            <w:tcW w:type="dxa" w:w="2160"/>
+          </w:tcPr>
+          <w:p>
+            <w:r>
+              <w:t>Q3 fq + price range</w:t>
+            </w:r>
+          </w:p>
+        </w:tc>
+        <w:tc>
+          <w:tcPr>
+            <w:tcW w:type="dxa" w:w="2160"/>
+          </w:tcPr>
+          <w:p>
+            <w:r>
+              <w:t>19.9</w:t>
+            </w:r>
+          </w:p>
+        </w:tc>
+        <w:tc>
+          <w:tcPr>
+            <w:tcW w:type="dxa" w:w="2160"/>
+          </w:tcPr>
+          <w:p>
+            <w:r>
+              <w:t>0.7</w:t>
+            </w:r>
+          </w:p>
+        </w:tc>
+        <w:tc>
+          <w:tcPr>
+            <w:tcW w:type="dxa" w:w="2160"/>
+          </w:tcPr>
+          <w:p>
+            <w:r>
+              <w:t>30x</w:t>
+            </w:r>
+          </w:p>
+        </w:tc>
+      </w:tr>
+      <w:tr>
+        <w:tc>
+          <w:tcPr>
+            <w:tcW w:type="dxa" w:w="2160"/>
+          </w:tcPr>
+          <w:p>
+            <w:r>
+              <w:t>Q4 multi-field facets</w:t>
+            </w:r>
+          </w:p>
+        </w:tc>
+        <w:tc>
+          <w:tcPr>
+            <w:tcW w:type="dxa" w:w="2160"/>
+          </w:tcPr>
+          <w:p>
+            <w:r>
+              <w:t>15.0</w:t>
+            </w:r>
+          </w:p>
+        </w:tc>
+        <w:tc>
+          <w:tcPr>
+            <w:tcW w:type="dxa" w:w="2160"/>
+          </w:tcPr>
+          <w:p>
+            <w:r>
+              <w:t>4.7</w:t>
+            </w:r>
+          </w:p>
+        </w:tc>
+        <w:tc>
+          <w:tcPr>
+            <w:tcW w:type="dxa" w:w="2160"/>
+          </w:tcPr>
+          <w:p>
+            <w:r>
+              <w:t>3x</w:t>
+            </w:r>
+          </w:p>
+        </w:tc>
+      </w:tr>
+      <w:tr>
+        <w:tc>
+          <w:tcPr>
+            <w:tcW w:type="dxa" w:w="2160"/>
+          </w:tcPr>
+          <w:p>
+            <w:r>
+              <w:t>Q5 sort year+rating</w:t>
+            </w:r>
+          </w:p>
+        </w:tc>
+        <w:tc>
+          <w:tcPr>
+            <w:tcW w:type="dxa" w:w="2160"/>
+          </w:tcPr>
+          <w:p>
+            <w:r>
+              <w:t>37.0</w:t>
+            </w:r>
+          </w:p>
+        </w:tc>
+        <w:tc>
+          <w:tcPr>
+            <w:tcW w:type="dxa" w:w="2160"/>
+          </w:tcPr>
+          <w:p>
+            <w:r>
+              <w:t>1.1</w:t>
+            </w:r>
+          </w:p>
+        </w:tc>
+        <w:tc>
+          <w:tcPr>
+            <w:tcW w:type="dxa" w:w="2160"/>
+          </w:tcPr>
+          <w:p>
+            <w:r>
+              <w:t>33x</w:t>
+            </w:r>
+          </w:p>
+        </w:tc>
+      </w:tr>
+      <w:tr>
+        <w:tc>
+          <w:tcPr>
+            <w:tcW w:type="dxa" w:w="2160"/>
+          </w:tcPr>
+          <w:p>
+            <w:r>
+              <w:t>Q6 highlighting</w:t>
+            </w:r>
+          </w:p>
+        </w:tc>
+        <w:tc>
+          <w:tcPr>
+            <w:tcW w:type="dxa" w:w="2160"/>
+          </w:tcPr>
+          <w:p>
+            <w:r>
+              <w:t>29.6</w:t>
+            </w:r>
+          </w:p>
+        </w:tc>
+        <w:tc>
+          <w:tcPr>
+            <w:tcW w:type="dxa" w:w="2160"/>
+          </w:tcPr>
+          <w:p>
+            <w:r>
+              <w:t>9.4</w:t>
+            </w:r>
+          </w:p>
+        </w:tc>
+        <w:tc>
+          <w:tcPr>
+            <w:tcW w:type="dxa" w:w="2160"/>
+          </w:tcPr>
+          <w:p>
+            <w:r>
+              <w:t>3x</w:t>
+            </w:r>
+          </w:p>
+        </w:tc>
+      </w:tr>
+      <w:tr>
+        <w:tc>
+          <w:tcPr>
+            <w:tcW w:type="dxa" w:w="2160"/>
+          </w:tcPr>
+          <w:p>
+            <w:r>
+              <w:t>Q9 fuzzy</w:t>
+            </w:r>
+          </w:p>
+        </w:tc>
+        <w:tc>
+          <w:tcPr>
+            <w:tcW w:type="dxa" w:w="2160"/>
+          </w:tcPr>
+          <w:p>
+            <w:r>
+              <w:t>22.7</w:t>
+            </w:r>
+          </w:p>
+        </w:tc>
+        <w:tc>
+          <w:tcPr>
+            <w:tcW w:type="dxa" w:w="2160"/>
+          </w:tcPr>
+          <w:p>
+            <w:r>
+              <w:t>1.6</w:t>
+            </w:r>
+          </w:p>
+        </w:tc>
+        <w:tc>
+          <w:tcPr>
+            <w:tcW w:type="dxa" w:w="2160"/>
+          </w:tcPr>
+          <w:p>
+            <w:r>
+              <w:t>15x</w:t>
+            </w:r>
+          </w:p>
+        </w:tc>
+      </w:tr>
+      <w:tr>
+        <w:tc>
+          <w:tcPr>
+            <w:tcW w:type="dxa" w:w="2160"/>
+          </w:tcPr>
+          <w:p>
+            <w:r>
+              <w:t>Q11 paging start=100</w:t>
+            </w:r>
+          </w:p>
+        </w:tc>
+        <w:tc>
+          <w:tcPr>
+            <w:tcW w:type="dxa" w:w="2160"/>
+          </w:tcPr>
+          <w:p>
+            <w:r>
+              <w:t>28.4</w:t>
+            </w:r>
+          </w:p>
+        </w:tc>
+        <w:tc>
+          <w:tcPr>
+            <w:tcW w:type="dxa" w:w="2160"/>
+          </w:tcPr>
+          <w:p>
+            <w:r>
+              <w:t>0.8</w:t>
+            </w:r>
+          </w:p>
+        </w:tc>
+        <w:tc>
+          <w:tcPr>
+            <w:tcW w:type="dxa" w:w="2160"/>
+          </w:tcPr>
+          <w:p>
+            <w:r>
+              <w:t>37x</w:t>
+            </w:r>
+          </w:p>
+        </w:tc>
+      </w:tr>
+    </w:tbl>
+    <w:p>
+      <w:r>
+        <w:rPr>
+          <w:b/>
+          <w:i w:val="0"/>
+          <w:sz w:val="22"/>
+        </w:rPr>
+        <w:t>Interpretation.</w:t>
+      </w:r>
+    </w:p>
+    <w:p>
+      <w:r>
+        <w:rPr>
+          <w:b w:val="0"/>
+          <w:i w:val="0"/>
+          <w:sz w:val="22"/>
+        </w:rPr>
+        <w:t>The distributed query is consistently slower than the single-shard equivalent on this dataset, by ratios of 3x to 37x. At 9,929 documents the per-shard work is so cheap (often sub-millisecond) that the coordinator overhead of a fan-out + merge dominates. Sharding pays off when the per-shard work itself is expensive enough to swamp the coordinator cost; that crossover usually sits in the millions-of-documents range. For this lab the cluster was the right thing to demonstrate the topology, but it would not be the right architecture for a production catalog of this size. Full per-query numbers including p95 are in report/benchmark_results.txt.</w:t>
+      </w:r>
+    </w:p>
+    <w:p>
+      <w:r>
+        <w:rPr>
+          <w:b/>
+          <w:i w:val="0"/>
+          <w:sz w:val="22"/>
+        </w:rPr>
+        <w:t>Suggester component (autocomplete).</w:t>
+      </w:r>
+    </w:p>
+    <w:p>
+      <w:r>
+        <w:rPr>
+          <w:b w:val="0"/>
+          <w:i w:val="0"/>
+          <w:sz w:val="22"/>
+        </w:rPr>
+        <w:t>After the empirical benchmark I replaced the original wildcard-based autocomplete with Solr's proper SuggestComponent. I posted this configuration to /solr/books/config:</w:t>
+      </w:r>
+    </w:p>
+    <w:p>
+      <w:r>
+        <w:rPr>
+          <w:rFonts w:ascii="Consolas" w:hAnsi="Consolas"/>
+          <w:sz w:val="18"/>
+        </w:rPr>
+        <w:t>{"add-searchcomponent":{</w:t>
+        <w:br/>
+        <w:t xml:space="preserve">   "name":"suggest_component",</w:t>
+        <w:br/>
+        <w:t xml:space="preserve">   "class":"solr.SuggestComponent",</w:t>
+        <w:br/>
+        <w:t xml:space="preserve">   "suggester":{</w:t>
+        <w:br/>
+        <w:t xml:space="preserve">     "name":"titleSuggester",</w:t>
+        <w:br/>
+        <w:t xml:space="preserve">     "lookupImpl":"AnalyzingInfixLookupFactory",</w:t>
+        <w:br/>
+        <w:t xml:space="preserve">     "dictionaryImpl":"DocumentDictionaryFactory",</w:t>
+        <w:br/>
+        <w:t xml:space="preserve">     "field":"title",</w:t>
+        <w:br/>
+        <w:t xml:space="preserve">     "suggestAnalyzerFieldType":"text_general",</w:t>
+        <w:br/>
+        <w:t xml:space="preserve">     "buildOnCommit":"true"</w:t>
+        <w:br/>
+        <w:t xml:space="preserve">   }},</w:t>
+        <w:br/>
+        <w:t xml:space="preserve"> "add-requesthandler":{</w:t>
+        <w:br/>
+        <w:t xml:space="preserve">   "name":"/suggest_handler",</w:t>
+        <w:br/>
+        <w:t xml:space="preserve">   "class":"solr.SearchHandler",</w:t>
+        <w:br/>
+        <w:t xml:space="preserve">   "defaults":{"suggest":"true","suggest.count":"10",</w:t>
+        <w:br/>
+        <w:t xml:space="preserve">              "suggest.dictionary":"titleSuggester"},</w:t>
+        <w:br/>
+        <w:t xml:space="preserve">   "components":["suggest_component"]}</w:t>
+        <w:br/>
+        <w:t>}</w:t>
+      </w:r>
+    </w:p>
+    <w:p>
+      <w:r>
+        <w:rPr>
+          <w:b w:val="0"/>
+          <w:i w:val="0"/>
+          <w:sz w:val="22"/>
+        </w:rPr>
+        <w:t>AnalyzingInfixLookupFactory does prefix AND infix matching against the analyzed title field, so 'harry' matches 'The Lincoln Lawyer (Mickey Haller, #1; Harry Bosch Universe, #16)' as well as 'Harry Potter and the Sorcerer's Stone'. The Flask /suggest endpoint now calls the Suggester first and falls back to the wildcard query if the handler isn't configured (older deployments). See Figure 16.</w:t>
+      </w:r>
+    </w:p>
+    <w:p>
+      <w:r>
+        <w:rPr>
+          <w:b/>
+          <w:i w:val="0"/>
+          <w:sz w:val="22"/>
+        </w:rPr>
+        <w:t>Side-finding while configuring this:</w:t>
+      </w:r>
+    </w:p>
+    <w:p>
+      <w:r>
+        <w:rPr>
+          <w:b w:val="0"/>
+          <w:i w:val="0"/>
+          <w:sz w:val="22"/>
+        </w:rPr>
+        <w:t>The Solr config API is strict about JSON value types. Sending buildOnCommit: true (boolean) returns 500 with a 'Boolean cannot be cast to String' ClassCastException in SuggestComponent.inform(). Quoting the value as "true" works. This is documented behavior in older Solr versions (the schema and config APIs accept JSON but coerce many fields back through string parsers internally).</w:t>
       </w:r>
     </w:p>
     <w:p>
@@ -1893,7 +2591,7 @@
           <w:i w:val="0"/>
           <w:sz w:val="22"/>
         </w:rPr>
-        <w:t>By the end I had a 2-node SolrCloud cluster running 9,929 real Goodreads records sharded across two cores, twelve query patterns working against the distributed collection, an empirical demonstration of why genre needs to be a string field rather than text_general, and a Flask UI exposing search, facets, range filters, sort, pagination, highlighting and autocomplete on top. Once the schema was right, almost every feature in the UI was just one HTTP GET against Solr.</w:t>
+        <w:t>By the end I had a 2-node SolrCloud cluster running 9,929 real Goodreads records sharded across two cores, twelve query patterns working against the distributed collection, an empirical demonstration of why genre needs to be a string field, a measured comparison of distributed vs single-shard latency (the distributed version is 3-37x slower at this scale because coordinator overhead dominates), a fault-tolerance test (node2 killed, queries still served from node1's replicas), the SuggestComponent wired in for real autocomplete, and a Flask UI on top exposing search, facets, range filters, sort, pagination, highlighting, autocomplete, and live search-as-you-type. Once the schema was right, almost every feature in the UI was just one HTTP GET against Solr.</w:t>
       </w:r>
     </w:p>
     <w:p>

</xml_diff>

<commit_message>
Polish report prose, embed all 19 screenshots, fix figure cross-references
</commit_message>
<xml_diff>
--- a/report/Lab13_Solr_Report.docx
+++ b/report/Lab13_Solr_Report.docx
@@ -1003,7 +1003,7 @@
               <a:graphicData uri="http://schemas.openxmlformats.org/drawingml/2006/picture">
                 <pic:pic>
                   <pic:nvPicPr>
-                    <pic:cNvPr id="0" name="10_schema_tab.png"/>
+                    <pic:cNvPr id="0" name="11_query_tab.png"/>
                     <pic:cNvPicPr/>
                   </pic:nvPicPr>
                   <pic:blipFill>
@@ -1035,7 +1035,7 @@
           <w:i/>
           <w:sz w:val="18"/>
         </w:rPr>
-        <w:t>Figure 3. Solr Admin &gt; Schema tab for the 'genre' field on the books collection. Field-Type is StrField (string), Tokenized=NO. This is the production-correct setting.</w:t>
+        <w:t>Figure 3. Solr Admin &gt; Query tab on the books collection — the in-browser query builder used for ad-hoc testing during development.</w:t>
       </w:r>
     </w:p>
     <w:p>
@@ -1051,7 +1051,7 @@
               <a:graphicData uri="http://schemas.openxmlformats.org/drawingml/2006/picture">
                 <pic:pic>
                   <pic:nvPicPr>
-                    <pic:cNvPr id="0" name="11_query_tab.png"/>
+                    <pic:cNvPr id="0" name="10_schema_tab.png"/>
                     <pic:cNvPicPr/>
                   </pic:nvPicPr>
                   <pic:blipFill>
@@ -1083,7 +1083,7 @@
           <w:i/>
           <w:sz w:val="18"/>
         </w:rPr>
-        <w:t>Figure 4. Solr Admin &gt; Query tab — the in-browser query builder used for ad-hoc testing.</w:t>
+        <w:t>Figure 4. Schema tab for the 'genre' field on the books (production) collection. Field-Type is StrField (string), Tokenized=NO. This is the production-correct setting.</w:t>
       </w:r>
     </w:p>
     <w:p>
@@ -1099,7 +1099,7 @@
               <a:graphicData uri="http://schemas.openxmlformats.org/drawingml/2006/picture">
                 <pic:pic>
                   <pic:nvPicPr>
-                    <pic:cNvPr id="0" name="02_indexed_count.png"/>
+                    <pic:cNvPr id="0" name="13_field_experiment_bad_schema.png"/>
                     <pic:cNvPicPr/>
                   </pic:nvPicPr>
                   <pic:blipFill>
@@ -1131,7 +1131,7 @@
           <w:i/>
           <w:sz w:val="18"/>
         </w:rPr>
-        <w:t>Figure 5. q=*:* against the books collection returns numFound=9929 (across both shards).</w:t>
+        <w:t>Figure 5. Schema tab for the same field on the books_bad collection: Field-Type is text_general, Tokenized=YES. Used as the deliberate-misconfiguration baseline for the field-types experiment in Section 6.</w:t>
       </w:r>
     </w:p>
     <w:p>
@@ -1147,7 +1147,7 @@
               <a:graphicData uri="http://schemas.openxmlformats.org/drawingml/2006/picture">
                 <pic:pic>
                   <pic:nvPicPr>
-                    <pic:cNvPr id="0" name="03_facet_query.png"/>
+                    <pic:cNvPr id="0" name="02_indexed_count.png"/>
                     <pic:cNvPicPr/>
                   </pic:nvPicPr>
                   <pic:blipFill>
@@ -1179,7 +1179,7 @@
           <w:i/>
           <w:sz w:val="18"/>
         </w:rPr>
-        <w:t>Figure 6. Faceted search by genre and publisher — distributed query merges counts from both shards.</w:t>
+        <w:t>Figure 6. q=*:* against the books collection returns numFound=9929 (across both shards).</w:t>
       </w:r>
     </w:p>
     <w:p>
@@ -1195,7 +1195,7 @@
               <a:graphicData uri="http://schemas.openxmlformats.org/drawingml/2006/picture">
                 <pic:pic>
                   <pic:nvPicPr>
-                    <pic:cNvPr id="0" name="04_highlight.png"/>
+                    <pic:cNvPr id="0" name="03_facet_query.png"/>
                     <pic:cNvPicPr/>
                   </pic:nvPicPr>
                   <pic:blipFill>
@@ -1227,7 +1227,7 @@
           <w:i/>
           <w:sz w:val="18"/>
         </w:rPr>
-        <w:t>Figure 7. Hit highlighting wraps matched terms with &lt;mark&gt; tags in the description field.</w:t>
+        <w:t>Figure 7. Faceted search by genre and publisher — the distributed query merges counts from both shards.</w:t>
       </w:r>
     </w:p>
     <w:p>
@@ -1243,7 +1243,7 @@
               <a:graphicData uri="http://schemas.openxmlformats.org/drawingml/2006/picture">
                 <pic:pic>
                   <pic:nvPicPr>
-                    <pic:cNvPr id="0" name="12_field_experiment.png"/>
+                    <pic:cNvPr id="0" name="04_highlight.png"/>
                     <pic:cNvPicPr/>
                   </pic:nvPicPr>
                   <pic:blipFill>
@@ -1275,7 +1275,7 @@
           <w:i/>
           <w:sz w:val="18"/>
         </w:rPr>
-        <w:t>Figure 8. Broken facet output from the books_bad collection (genre declared as text_general). 'Science Fiction' and 'Historical Fiction' have been split by the analyzer; the 'fiction' token now has count=4 because both source values contributed to it.</w:t>
+        <w:t>Figure 8. Hit highlighting wraps matched terms with &lt;mark&gt; tags in the description field.</w:t>
       </w:r>
     </w:p>
     <w:p>
@@ -1291,7 +1291,7 @@
               <a:graphicData uri="http://schemas.openxmlformats.org/drawingml/2006/picture">
                 <pic:pic>
                   <pic:nvPicPr>
-                    <pic:cNvPr id="0" name="05_web_ui.png"/>
+                    <pic:cNvPr id="0" name="12_field_experiment.png"/>
                     <pic:cNvPicPr/>
                   </pic:nvPicPr>
                   <pic:blipFill>
@@ -1323,7 +1323,7 @@
           <w:i/>
           <w:sz w:val="18"/>
         </w:rPr>
-        <w:t>Figure 9. Flask web UI: search for 'potter' returns the Harry Potter series with highlighted hits, sidebar facets, and metadata.</w:t>
+        <w:t>Figure 9. Broken facet output from books_bad: the StandardTokenizer split 'Science Fiction' and 'Historical Fiction' into individual tokens, and the two 'fiction' tokens collapsed into a single bucket of 4. The genre information is destroyed.</w:t>
       </w:r>
     </w:p>
     <w:p>
@@ -1339,7 +1339,7 @@
               <a:graphicData uri="http://schemas.openxmlformats.org/drawingml/2006/picture">
                 <pic:pic>
                   <pic:nvPicPr>
-                    <pic:cNvPr id="0" name="06_autocomplete.png"/>
+                    <pic:cNvPr id="0" name="05_web_ui.png"/>
                     <pic:cNvPicPr/>
                   </pic:nvPicPr>
                   <pic:blipFill>
@@ -1371,7 +1371,7 @@
           <w:i/>
           <w:sz w:val="18"/>
         </w:rPr>
-        <w:t>Figure 10. Search results for the query 'harry'.</w:t>
+        <w:t>Figure 10. Flask web UI: a search for 'potter' returns the Harry Potter series with highlighted hits, sidebar facets, and full metadata.</w:t>
       </w:r>
     </w:p>
     <w:p>
@@ -1387,7 +1387,7 @@
               <a:graphicData uri="http://schemas.openxmlformats.org/drawingml/2006/picture">
                 <pic:pic>
                   <pic:nvPicPr>
-                    <pic:cNvPr id="0" name="07_facet_ui.png"/>
+                    <pic:cNvPr id="0" name="06_autocomplete.png"/>
                     <pic:cNvPicPr/>
                   </pic:nvPicPr>
                   <pic:blipFill>
@@ -1419,7 +1419,7 @@
           <w:i/>
           <w:sz w:val="18"/>
         </w:rPr>
-        <w:t>Figure 11. Facet drilldown: filtering on genre = English (UK) updates the result list and the sidebar's co-occurring publishers.</w:t>
+        <w:t>Figure 11. Search results for the query 'harry'.</w:t>
       </w:r>
     </w:p>
     <w:p>
@@ -1435,7 +1435,7 @@
               <a:graphicData uri="http://schemas.openxmlformats.org/drawingml/2006/picture">
                 <pic:pic>
                   <pic:nvPicPr>
-                    <pic:cNvPr id="0" name="08_sort_ui.png"/>
+                    <pic:cNvPr id="0" name="07_facet_ui.png"/>
                     <pic:cNvPicPr/>
                   </pic:nvPicPr>
                   <pic:blipFill>
@@ -1467,7 +1467,7 @@
           <w:i/>
           <w:sz w:val="18"/>
         </w:rPr>
-        <w:t>Figure 12. Sort by year descending returns the newest titles first.</w:t>
+        <w:t>Figure 12. Facet drilldown: filtering on genre = English (UK) updates the result list and the sidebar's co-occurring publishers.</w:t>
       </w:r>
     </w:p>
     <w:p>
@@ -1483,7 +1483,7 @@
               <a:graphicData uri="http://schemas.openxmlformats.org/drawingml/2006/picture">
                 <pic:pic>
                   <pic:nvPicPr>
-                    <pic:cNvPr id="0" name="14_live_search.png"/>
+                    <pic:cNvPr id="0" name="08_sort_ui.png"/>
                     <pic:cNvPicPr/>
                   </pic:nvPicPr>
                   <pic:blipFill>
@@ -1515,7 +1515,7 @@
           <w:i/>
           <w:sz w:val="18"/>
         </w:rPr>
-        <w:t>Figure 13. Live search-as-you-type — the result list re-renders on every keystroke via fetch to /api/search; the URL bar updates with history.replaceState so any state remains shareable.</w:t>
+        <w:t>Figure 13. Sort by year descending returns the newest titles first.</w:t>
       </w:r>
     </w:p>
     <w:p>
@@ -1531,7 +1531,7 @@
               <a:graphicData uri="http://schemas.openxmlformats.org/drawingml/2006/picture">
                 <pic:pic>
                   <pic:nvPicPr>
-                    <pic:cNvPr id="0" name="16_failover_after.png"/>
+                    <pic:cNvPr id="0" name="14_live_search.png"/>
                     <pic:cNvPicPr/>
                   </pic:nvPicPr>
                   <pic:blipFill>
@@ -1563,7 +1563,7 @@
           <w:i/>
           <w:sz w:val="18"/>
         </w:rPr>
-        <w:t>Figure 14. Cluster topology after stopping node2 (port 7574). Only one node remains live; the books collection is still fully available because each shard has a replica on the surviving node.</w:t>
+        <w:t>Figure 14. Live search-as-you-type. The result list re-renders on every keystroke via fetch to /api/search, and history.replaceState keeps the URL in sync so any state remains shareable.</w:t>
       </w:r>
     </w:p>
     <w:p>
@@ -1579,7 +1579,7 @@
               <a:graphicData uri="http://schemas.openxmlformats.org/drawingml/2006/picture">
                 <pic:pic>
                   <pic:nvPicPr>
-                    <pic:cNvPr id="0" name="17_failover_query.png"/>
+                    <pic:cNvPr id="0" name="15_failover_before.png"/>
                     <pic:cNvPicPr/>
                   </pic:nvPicPr>
                   <pic:blipFill>
@@ -1611,7 +1611,7 @@
           <w:i/>
           <w:sz w:val="18"/>
         </w:rPr>
-        <w:t>Figure 15. Web UI search for 'potter' continues to return all 29 results while node2 is down — confirming fault-tolerant distributed search.</w:t>
+        <w:t>Figure 15. Cluster topology before the failover test: both nodes (8983 and 7574) live, books collection's four replicas (s1r4, s1r6, s2r1, s2r2) spread across them.</w:t>
       </w:r>
     </w:p>
     <w:p>
@@ -1627,7 +1627,7 @@
               <a:graphicData uri="http://schemas.openxmlformats.org/drawingml/2006/picture">
                 <pic:pic>
                   <pic:nvPicPr>
-                    <pic:cNvPr id="0" name="19_suggester.png"/>
+                    <pic:cNvPr id="0" name="16_failover_after.png"/>
                     <pic:cNvPicPr/>
                   </pic:nvPicPr>
                   <pic:blipFill>
@@ -1659,7 +1659,151 @@
           <w:i/>
           <w:sz w:val="18"/>
         </w:rPr>
-        <w:t>Figure 16. SuggestComponent response for suggest.q=harry — returns full title strings with the matched substring wrapped in &lt;b&gt;...&lt;/b&gt; via AnalyzingInfixLookupFactory.</w:t>
+        <w:t>Figure 16. Same view after running 'solr.cmd stop -p 7574'. Only one node is live; the books collection is still fully available because each shard has a replica on the surviving node.</w:t>
+      </w:r>
+    </w:p>
+    <w:p>
+      <w:r>
+        <w:drawing>
+          <wp:inline xmlns:a="http://schemas.openxmlformats.org/drawingml/2006/main" xmlns:pic="http://schemas.openxmlformats.org/drawingml/2006/picture">
+            <wp:extent cx="5486400" cy="3857625"/>
+            <wp:docPr id="17" name="Picture 17"/>
+            <wp:cNvGraphicFramePr>
+              <a:graphicFrameLocks noChangeAspect="1"/>
+            </wp:cNvGraphicFramePr>
+            <a:graphic>
+              <a:graphicData uri="http://schemas.openxmlformats.org/drawingml/2006/picture">
+                <pic:pic>
+                  <pic:nvPicPr>
+                    <pic:cNvPr id="0" name="17_failover_query.png"/>
+                    <pic:cNvPicPr/>
+                  </pic:nvPicPr>
+                  <pic:blipFill>
+                    <a:blip r:embed="rId25"/>
+                    <a:stretch>
+                      <a:fillRect/>
+                    </a:stretch>
+                  </pic:blipFill>
+                  <pic:spPr>
+                    <a:xfrm>
+                      <a:off x="0" y="0"/>
+                      <a:ext cx="5486400" cy="3857625"/>
+                    </a:xfrm>
+                    <a:prstGeom prst="rect"/>
+                  </pic:spPr>
+                </pic:pic>
+              </a:graphicData>
+            </a:graphic>
+          </wp:inline>
+        </w:drawing>
+      </w:r>
+    </w:p>
+    <w:p>
+      <w:pPr>
+        <w:jc w:val="center"/>
+      </w:pPr>
+      <w:r>
+        <w:rPr>
+          <w:i/>
+          <w:sz w:val="18"/>
+        </w:rPr>
+        <w:t>Figure 17. Flask web UI search for 'potter' returns all 29 results while node2 is down — confirming fault-tolerant distributed search.</w:t>
+      </w:r>
+    </w:p>
+    <w:p>
+      <w:r>
+        <w:drawing>
+          <wp:inline xmlns:a="http://schemas.openxmlformats.org/drawingml/2006/main" xmlns:pic="http://schemas.openxmlformats.org/drawingml/2006/picture">
+            <wp:extent cx="5486400" cy="3857625"/>
+            <wp:docPr id="18" name="Picture 18"/>
+            <wp:cNvGraphicFramePr>
+              <a:graphicFrameLocks noChangeAspect="1"/>
+            </wp:cNvGraphicFramePr>
+            <a:graphic>
+              <a:graphicData uri="http://schemas.openxmlformats.org/drawingml/2006/picture">
+                <pic:pic>
+                  <pic:nvPicPr>
+                    <pic:cNvPr id="0" name="18_failover_json.png"/>
+                    <pic:cNvPicPr/>
+                  </pic:nvPicPr>
+                  <pic:blipFill>
+                    <a:blip r:embed="rId26"/>
+                    <a:stretch>
+                      <a:fillRect/>
+                    </a:stretch>
+                  </pic:blipFill>
+                  <pic:spPr>
+                    <a:xfrm>
+                      <a:off x="0" y="0"/>
+                      <a:ext cx="5486400" cy="3857625"/>
+                    </a:xfrm>
+                    <a:prstGeom prst="rect"/>
+                  </pic:spPr>
+                </pic:pic>
+              </a:graphicData>
+            </a:graphic>
+          </wp:inline>
+        </w:drawing>
+      </w:r>
+    </w:p>
+    <w:p>
+      <w:pPr>
+        <w:jc w:val="center"/>
+      </w:pPr>
+      <w:r>
+        <w:rPr>
+          <w:i/>
+          <w:sz w:val="18"/>
+        </w:rPr>
+        <w:t>Figure 18. Raw Solr JSON response for the same query during the failover, captured directly from the surviving node1 endpoint.</w:t>
+      </w:r>
+    </w:p>
+    <w:p>
+      <w:r>
+        <w:drawing>
+          <wp:inline xmlns:a="http://schemas.openxmlformats.org/drawingml/2006/main" xmlns:pic="http://schemas.openxmlformats.org/drawingml/2006/picture">
+            <wp:extent cx="5486400" cy="3857625"/>
+            <wp:docPr id="19" name="Picture 19"/>
+            <wp:cNvGraphicFramePr>
+              <a:graphicFrameLocks noChangeAspect="1"/>
+            </wp:cNvGraphicFramePr>
+            <a:graphic>
+              <a:graphicData uri="http://schemas.openxmlformats.org/drawingml/2006/picture">
+                <pic:pic>
+                  <pic:nvPicPr>
+                    <pic:cNvPr id="0" name="19_suggester.png"/>
+                    <pic:cNvPicPr/>
+                  </pic:nvPicPr>
+                  <pic:blipFill>
+                    <a:blip r:embed="rId27"/>
+                    <a:stretch>
+                      <a:fillRect/>
+                    </a:stretch>
+                  </pic:blipFill>
+                  <pic:spPr>
+                    <a:xfrm>
+                      <a:off x="0" y="0"/>
+                      <a:ext cx="5486400" cy="3857625"/>
+                    </a:xfrm>
+                    <a:prstGeom prst="rect"/>
+                  </pic:spPr>
+                </pic:pic>
+              </a:graphicData>
+            </a:graphic>
+          </wp:inline>
+        </w:drawing>
+      </w:r>
+    </w:p>
+    <w:p>
+      <w:pPr>
+        <w:jc w:val="center"/>
+      </w:pPr>
+      <w:r>
+        <w:rPr>
+          <w:i/>
+          <w:sz w:val="18"/>
+        </w:rPr>
+        <w:t>Figure 19. SuggestComponent response for suggest.q=harry — returns full title strings with the matched substring wrapped in &lt;b&gt;...&lt;/b&gt; via AnalyzingInfixLookupFactory.</w:t>
       </w:r>
     </w:p>
     <w:p>
@@ -1780,7 +1924,7 @@
           <w:i w:val="0"/>
           <w:sz w:val="22"/>
         </w:rPr>
-        <w:t>books_bad facet output (Figure 8): 'fiction' -&gt; 4, 'crime' -&gt; 2, 'historical' -&gt; 2, 'science' -&gt; 2, 'thriller' -&gt; 2.</w:t>
+        <w:t>books_bad facet output (Figure 9): 'fiction' -&gt; 4, 'crime' -&gt; 2, 'historical' -&gt; 2, 'science' -&gt; 2, 'thriller' -&gt; 2.</w:t>
       </w:r>
     </w:p>
     <w:p>
@@ -1840,7 +1984,7 @@
           <w:i w:val="0"/>
           <w:sz w:val="22"/>
         </w:rPr>
-        <w:t>I tested the cluster's tolerance to a node failure. Starting from both nodes up and 9,929 documents indexed, I stopped node2 with 'solr.cmd stop -p 7574' and re-ran the production queries against the surviving node1 endpoint. The cluster status reported live_nodes = ['localhost:8983_solr'] (only one node), but queries continued to return correct results: q=*:* still numFound=9929, edismax q=potter still numFound=29 with the Harry Potter series at the top. This works because each shard has replicationFactor=2, so the data is mirrored across both nodes; node1 already holds a full replica of every shard. After verification I restarted node2 and the cluster returned to its original 2-node state with no manual intervention. See Figures 14, 15 in the screenshots section.</w:t>
+        <w:t>I tested the cluster's tolerance to a node failure. Starting from both nodes up and 9,929 documents indexed, I stopped node2 with 'solr.cmd stop -p 7574' and re-ran the production queries against the surviving node1 endpoint. The cluster status reported live_nodes = ['localhost:8983_solr'] (only one node), but queries continued to return correct results: q=*:* still numFound=9929, edismax q=potter still numFound=29 with the Harry Potter series at the top. This works because each shard has replicationFactor=2, so the data is mirrored across both nodes; node1 already holds a full replica of every shard. After verification I restarted node2 and the cluster returned to its original 2-node state with no manual intervention. See Figures 15-18 in the screenshots section.</w:t>
       </w:r>
     </w:p>
     <w:p>
@@ -2281,7 +2425,17 @@
           <w:i w:val="0"/>
           <w:sz w:val="22"/>
         </w:rPr>
-        <w:t>The distributed query is consistently slower than the single-shard equivalent on this dataset, by ratios of 3x to 37x. At 9,929 documents the per-shard work is so cheap (often sub-millisecond) that the coordinator overhead of a fan-out + merge dominates. Sharding pays off when the per-shard work itself is expensive enough to swamp the coordinator cost; that crossover usually sits in the millions-of-documents range. For this lab the cluster was the right thing to demonstrate the topology, but it would not be the right architecture for a production catalog of this size. Full per-query numbers including p95 are in report/benchmark_results.txt.</w:t>
+        <w:t>Distributed wins zero of the twelve queries. It's 3x to 37x slower than the single-shard equivalent across the board. The reason is boring once you look at the single-shard column: each shard's work is already sub-millisecond. There is nothing to parallelize. The coordinator still has to fan out, wait for the slowest replica, and merge the responses, and that overhead is what we are actually measuring.</w:t>
+      </w:r>
+    </w:p>
+    <w:p>
+      <w:r>
+        <w:rPr>
+          <w:b w:val="0"/>
+          <w:i w:val="0"/>
+          <w:sz w:val="22"/>
+        </w:rPr>
+        <w:t>Sharding starts to pay off when the per-shard work is expensive enough to make the coordinator cost look small. For Lucene that usually means millions of documents, not ten thousand. For this lab the cluster was worth setting up because the prerequisite asked for it and because it lets me demonstrate failover, but I would not run a 10K-record catalog this way in production. Per-query numbers including p95 are in report/benchmark_results.txt.</w:t>
       </w:r>
     </w:p>
     <w:p>
@@ -2354,7 +2508,7 @@
           <w:i w:val="0"/>
           <w:sz w:val="22"/>
         </w:rPr>
-        <w:t>AnalyzingInfixLookupFactory does prefix AND infix matching against the analyzed title field, so 'harry' matches 'The Lincoln Lawyer (Mickey Haller, #1; Harry Bosch Universe, #16)' as well as 'Harry Potter and the Sorcerer's Stone'. The Flask /suggest endpoint now calls the Suggester first and falls back to the wildcard query if the handler isn't configured (older deployments). See Figure 16.</w:t>
+        <w:t>AnalyzingInfixLookupFactory does prefix AND infix matching against the analyzed title field, so 'harry' matches 'The Lincoln Lawyer (Mickey Haller, #1; Harry Bosch Universe, #16)' as well as 'Harry Potter and the Sorcerer's Stone'. The Flask /suggest endpoint now calls the Suggester first and falls back to the wildcard query if the handler isn't configured (older deployments). See Figure 19.</w:t>
       </w:r>
     </w:p>
     <w:p>
@@ -2374,7 +2528,7 @@
           <w:i w:val="0"/>
           <w:sz w:val="22"/>
         </w:rPr>
-        <w:t>The Solr config API is strict about JSON value types. Sending buildOnCommit: true (boolean) returns 500 with a 'Boolean cannot be cast to String' ClassCastException in SuggestComponent.inform(). Quoting the value as "true" works. This is documented behavior in older Solr versions (the schema and config APIs accept JSON but coerce many fields back through string parsers internally).</w:t>
+        <w:t>The first time I posted this config I sent buildOnCommit: true as a JSON boolean and got a 500 back. The Solr server log had the real story: 'class java.lang.Boolean cannot be cast to class java.lang.String' inside SuggestComponent.inform(). Quoting it as "true" worked immediately. The schema and config APIs accept JSON but pass several values through string parsers internally, so any unquoted boolean or number can hit this.</w:t>
       </w:r>
     </w:p>
     <w:p>
@@ -2591,7 +2745,17 @@
           <w:i w:val="0"/>
           <w:sz w:val="22"/>
         </w:rPr>
-        <w:t>By the end I had a 2-node SolrCloud cluster running 9,929 real Goodreads records sharded across two cores, twelve query patterns working against the distributed collection, an empirical demonstration of why genre needs to be a string field, a measured comparison of distributed vs single-shard latency (the distributed version is 3-37x slower at this scale because coordinator overhead dominates), a fault-tolerance test (node2 killed, queries still served from node1's replicas), the SuggestComponent wired in for real autocomplete, and a Flask UI on top exposing search, facets, range filters, sort, pagination, highlighting, autocomplete, and live search-as-you-type. Once the schema was right, almost every feature in the UI was just one HTTP GET against Solr.</w:t>
+        <w:t>By the end I had a 2-node SolrCloud cluster holding 9,929 real Goodreads books across two shards, with replicas mirrored so a node failure does not take queries down. Twelve query patterns work against the distributed collection. The Flask UI on top covers search, facets, range filters, sort, pagination, highlighting, real autocomplete (via SuggestComponent), and search-as-you-type.</w:t>
+      </w:r>
+    </w:p>
+    <w:p>
+      <w:r>
+        <w:rPr>
+          <w:b w:val="0"/>
+          <w:i w:val="0"/>
+          <w:sz w:val="22"/>
+        </w:rPr>
+        <w:t>Two findings I want to keep from the empirical work. First, schema choices are load-bearing in a way I did not appreciate before: declaring genre as text_general silently splits multi-word values across separate facet buckets. Second, sharding at this corpus size is a net loss. The distributed version of every query I ran was 3 to 37 times slower than the single-shard equivalent because the coordinator overhead is the dominant cost when the per-shard work is already sub-millisecond. I would still set up the cluster for the topology and failover demos, but I would not shard a 10K-document catalog in production.</w:t>
       </w:r>
     </w:p>
     <w:p>

</xml_diff>

<commit_message>
Switch to real Amazon-products dataset (no synthetic fields)
- New dataset: 996 real Amazon products from Bright Data public sample
  (title, brand, category, subcategory, price, rating, reviews, in_stock,
  description) — every field read from source, no hash-derived columns
- Schema renamed: author -> brand, genre -> category, publisher -> subcategory,
  pages -> num_reviews
- Added brand_text copyField (text_general) for full-text search while
  keeping brand as string for facet correctness
- Collection renamed books -> products throughout (Flask, setup, README,
  benchmark, sample queries, report)
- Re-ran benchmark on new data: distributed still 1.5x-40x slower than
  single-shard at this corpus size, table updated
- Re-did fault-tolerance demo and field-types experiment with new schema
  (products_bad with category as text_general)
- Re-captured all 19 screenshots
- Updated report to remove the synthetic-fields disclosure and note the
  copyField pattern in the schema rationale
</commit_message>
<xml_diff>
--- a/report/Lab13_Solr_Report.docx
+++ b/report/Lab13_Solr_Report.docx
@@ -57,7 +57,7 @@
           <w:i w:val="0"/>
           <w:sz w:val="22"/>
         </w:rPr>
-        <w:t>The lab task is to set up Apache Solr, index a real dataset, run a range of search queries against it, and put a web UI on top. Apache Solr is a Lucene-based search engine. It speaks HTTP, so most of the work in the UI is just translating form fields into query parameters. This report covers both halves, with enough configuration detail that the grader can reproduce the setup on a fresh machine.</w:t>
+        <w:t>The lab task is to set up Apache Solr, index a real dataset, run a range of search queries against it, and put a web UI on top. Apache Solr is a Lucene-based search engine. It speaks HTTP, so most of the work in the UI is just translating form fields into query parameters. I picked a real Amazon product catalog as the corpus because it gives every UI feature (price-range filtering, in-stock facet, brand drilldown, rating sort) something real to operate on. This report covers both halves, with enough configuration detail that the grader can reproduce the setup on a fresh machine.</w:t>
       </w:r>
     </w:p>
     <w:p>
@@ -78,7 +78,7 @@
           <w:i w:val="0"/>
           <w:sz w:val="22"/>
         </w:rPr>
-        <w:t>The dataset is the open Goodbooks-10K corpus (github.com/zygmuntz/goodbooks-10k), a public-domain CSV of the 10,000 most-rated books on Goodreads. After dropping rows with a missing or out-of-range publication year I had 9,929 usable records. The script at data/transform_goodbooks.py reshapes the raw columns into the project's schema. The real fields (title, author, year, rating, language) are kept verbatim. Three fields the original dataset does not provide (publisher, page count, price, in_stock) are filled in deterministically from a hash of book_id so the price-range filter and stock facet in the UI still demonstrate something. This is documented honestly in the transform script and in the README.</w:t>
+        <w:t>The dataset is the Bright Data Amazon-products sample (github.com/luminati-io/Amazon-dataset-samples), a public CSV of 1,000 real Amazon listings with 55 columns each. data/transform_amazon.py extracts the 11 fields used by this lab and drops 4 rows that are missing brand, price, or rating. The result is 996 products with all fields read directly from the source — no hash-derived or synthetic values.</w:t>
       </w:r>
     </w:p>
     <w:p>
@@ -88,7 +88,7 @@
           <w:i w:val="0"/>
           <w:sz w:val="22"/>
         </w:rPr>
-        <w:t>Each record is a single book with these fields:</w:t>
+        <w:t>Each record is a single product with these fields:</w:t>
       </w:r>
     </w:p>
     <w:tbl>
@@ -161,7 +161,7 @@
           </w:tcPr>
           <w:p>
             <w:r>
-              <w:t>Unique book identifier (BK0001..BK0600)</w:t>
+              <w:t>Amazon ASIN (B09NQJFRW6, B0074TRKFI, ...)</w:t>
             </w:r>
           </w:p>
         </w:tc>
@@ -193,7 +193,7 @@
           </w:tcPr>
           <w:p>
             <w:r>
-              <w:t>Book title (full-text indexed)</w:t>
+              <w:t>Product name (full-text indexed)</w:t>
             </w:r>
           </w:p>
         </w:tc>
@@ -205,7 +205,39 @@
           </w:tcPr>
           <w:p>
             <w:r>
-              <w:t>author</w:t>
+              <w:t>brand</w:t>
+            </w:r>
+          </w:p>
+        </w:tc>
+        <w:tc>
+          <w:tcPr>
+            <w:tcW w:type="dxa" w:w="2880"/>
+          </w:tcPr>
+          <w:p>
+            <w:r>
+              <w:t>string</w:t>
+            </w:r>
+          </w:p>
+        </w:tc>
+        <w:tc>
+          <w:tcPr>
+            <w:tcW w:type="dxa" w:w="2880"/>
+          </w:tcPr>
+          <w:p>
+            <w:r>
+              <w:t>Brand name — used as facet, untokenized so 'New Balance' stays one bucket</w:t>
+            </w:r>
+          </w:p>
+        </w:tc>
+      </w:tr>
+      <w:tr>
+        <w:tc>
+          <w:tcPr>
+            <w:tcW w:type="dxa" w:w="2880"/>
+          </w:tcPr>
+          <w:p>
+            <w:r>
+              <w:t>brand_text</w:t>
             </w:r>
           </w:p>
         </w:tc>
@@ -225,7 +257,7 @@
           </w:tcPr>
           <w:p>
             <w:r>
-              <w:t>Author name (full-text indexed)</w:t>
+              <w:t>Tokenized copy of brand for full-text search; populated via copyField</w:t>
             </w:r>
           </w:p>
         </w:tc>
@@ -237,7 +269,7 @@
           </w:tcPr>
           <w:p>
             <w:r>
-              <w:t>genre</w:t>
+              <w:t>category</w:t>
             </w:r>
           </w:p>
         </w:tc>
@@ -257,7 +289,7 @@
           </w:tcPr>
           <w:p>
             <w:r>
-              <w:t>Categorical — used as facet</w:t>
+              <w:t>Top-level Amazon category — facet field</w:t>
             </w:r>
           </w:p>
         </w:tc>
@@ -269,7 +301,7 @@
           </w:tcPr>
           <w:p>
             <w:r>
-              <w:t>publisher</w:t>
+              <w:t>subcategory</w:t>
             </w:r>
           </w:p>
         </w:tc>
@@ -289,7 +321,7 @@
           </w:tcPr>
           <w:p>
             <w:r>
-              <w:t>Categorical — used as facet</w:t>
+              <w:t>Second-level Amazon category — facet field</w:t>
             </w:r>
           </w:p>
         </w:tc>
@@ -321,7 +353,7 @@
           </w:tcPr>
           <w:p>
             <w:r>
-              <w:t>Publication year, range-filterable</w:t>
+              <w:t>First-available year, parsed from date_first_available</w:t>
             </w:r>
           </w:p>
         </w:tc>
@@ -333,7 +365,7 @@
           </w:tcPr>
           <w:p>
             <w:r>
-              <w:t>pages</w:t>
+              <w:t>num_reviews</w:t>
             </w:r>
           </w:p>
         </w:tc>
@@ -353,7 +385,7 @@
           </w:tcPr>
           <w:p>
             <w:r>
-              <w:t>Page count</w:t>
+              <w:t>Review count from Amazon, sortable</w:t>
             </w:r>
           </w:p>
         </w:tc>
@@ -385,7 +417,7 @@
           </w:tcPr>
           <w:p>
             <w:r>
-              <w:t>Cover price in USD</w:t>
+              <w:t>Real Amazon price in USD</w:t>
             </w:r>
           </w:p>
         </w:tc>
@@ -417,7 +449,7 @@
           </w:tcPr>
           <w:p>
             <w:r>
-              <w:t>Average reader rating (2.5-5.0)</w:t>
+              <w:t>Real Amazon star rating (1.0-5.0)</w:t>
             </w:r>
           </w:p>
         </w:tc>
@@ -449,7 +481,7 @@
           </w:tcPr>
           <w:p>
             <w:r>
-              <w:t>Inventory flag</w:t>
+              <w:t>Mapped from the availability column (true unless 'out of stock' / 'unavailable')</w:t>
             </w:r>
           </w:p>
         </w:tc>
@@ -481,7 +513,7 @@
           </w:tcPr>
           <w:p>
             <w:r>
-              <w:t>Marketing blurb, full-text indexed</w:t>
+              <w:t>Real product description, truncated to 1500 chars</w:t>
             </w:r>
           </w:p>
         </w:tc>
@@ -503,7 +535,7 @@
           <w:i w:val="0"/>
           <w:sz w:val="22"/>
         </w:rPr>
-        <w:t>Source: github.com/zygmuntz/goodbooks-10k (CC0). Format: CSV, 9,929 rows, ~2 MB after transformation. Genre buckets correspond to the language_code of the original record (English dominates with 7,368 books, followed by English (US) with 2,061; smaller buckets cover Spanish, French, German, Arabic, Japanese and others). Publication years span 1500-2025.</w:t>
+        <w:t>Source: github.com/luminati-io/Amazon-dataset-samples. Format: CSV, 996 rows after cleaning, ~2 MB. Top categories are Clothing/Shoes/Jewelry (216), Home &amp; Kitchen (150), Tools &amp; Home Improvement (112), Sports &amp; Outdoors (78) and Electronics (75). Brands range from household names (Skechers, New Balance, BOSCH, adidas) to long-tail third-party sellers.</w:t>
       </w:r>
     </w:p>
     <w:p>
@@ -560,7 +592,7 @@
           <w:i w:val="0"/>
           <w:sz w:val="22"/>
         </w:rPr>
-        <w:t>I started Solr with 'solr.cmd -e cloud -noprompt', which provisions a two-node cluster: node1 on port 8983 and node2 on port 7574, with an embedded ZooKeeper instance on port 9983 coordinating cluster state. The 'books' collection is created with numShards=2 and replicationFactor=2, giving 4 cores total: each shard has a leader on one node and a replica on the other. With ~9,929 documents this puts roughly 5,000 documents in each shard. The Flask UI continues to talk to a single endpoint (http://localhost:8983/solr/books/select); Solr transparently fan-outs the query to both shards and merges the results.</w:t>
+        <w:t>I started Solr with 'solr.cmd -e cloud -noprompt', which provisions a two-node cluster: node1 on port 8983 and node2 on port 7574, with an embedded ZooKeeper instance on port 9983 coordinating cluster state. The 'products' collection is created with numShards=2 and replicationFactor=2, giving 4 cores total: each shard has a leader on one node and a replica on the other. With ~996 documents that puts roughly 498 in each shard. The Flask UI talks to a single endpoint (http://localhost:8983/solr/products/select) and Solr transparently fan-outs the query to both shards and merges the results.</w:t>
       </w:r>
     </w:p>
     <w:p>
@@ -580,7 +612,7 @@
           <w:i w:val="0"/>
           <w:sz w:val="22"/>
         </w:rPr>
-        <w:t>I created the core with 'solr.cmd create -c books', which gives you the default managed-schema configset. Then I POSTed add-field requests to http://localhost:8983/solr/books/schema to lock in the field types I wanted (setup.ps1). Doing this BEFORE the first index run matters; once Solr's schemaless mode auto-detects a field as string, you can't change it without wiping the index.</w:t>
+        <w:t>The collection 'products' was created via the SolrCloud Collections API with numShards=2 and replicationFactor=2. Schema fields were registered via add-field POSTs to /solr/products/schema (setup.ps1). Doing this BEFORE the first index run matters: once Solr's schemaless mode auto-detects a field, you cannot change it without wiping the collection.</w:t>
       </w:r>
     </w:p>
     <w:p>
@@ -600,11 +632,13 @@
           <w:i w:val="0"/>
           <w:sz w:val="22"/>
         </w:rPr>
-        <w:t>* text_general for title/author/description. The StandardTokenizer plus lowercase and stopword filters make full-text search case-insensitive without any extra normalization on my side.</w:t>
+        <w:t>* text_general for title and description. StandardTokenizer + lowercase + stopword filters give case-insensitive full-text search without extra work on my side.</w:t>
         <w:br/>
-        <w:t>* string for genre and publisher. These are facet keys, so I do not want the analyzer to split 'Science Fiction' into two tokens.</w:t>
+        <w:t>* string for brand, category and subcategory. These are facet fields. If brand were tokenized 'New Balance' would become two buckets ('new', 'balance'), which is exactly the bug Section 6 demonstrates with category in a side experiment.</w:t>
         <w:br/>
-        <w:t>* pint, pfloat, boolean for the numeric and flag fields. Point-based numerics are the right choice for the year/price range queries used later.</w:t>
+        <w:t>* copyField from brand to brand_text (text_general). brand stays untokenized so the facet is correct, while brand_text gets fed by the analyzer chain so a query like 'asics' still matches the brand 'ASICS' through case folding.</w:t>
+        <w:br/>
+        <w:t>* pint, pfloat, boolean for the numeric and flag fields. Point-based numerics are the right choice for the price-range filter and rating-sort used in the UI.</w:t>
       </w:r>
     </w:p>
     <w:p>
@@ -675,7 +709,7 @@
           <w:i w:val="0"/>
           <w:sz w:val="22"/>
         </w:rPr>
-        <w:t xml:space="preserve">   curl https://raw.githubusercontent.com/zygmuntz/goodbooks-10k/master/books.csv into data/goodbooks_raw.csv (10,000 rows).</w:t>
+        <w:t xml:space="preserve">   curl the raw Amazon-products sample from github.com/luminati-io/Amazon-dataset-samples into data/amazon_raw.csv (1,000 rows, 55 columns).</w:t>
       </w:r>
     </w:p>
     <w:p>
@@ -695,7 +729,7 @@
           <w:i w:val="0"/>
           <w:sz w:val="22"/>
         </w:rPr>
-        <w:t xml:space="preserve">   python data/transform_goodbooks.py maps raw columns into the project schema and drops 71 rows with bad publication years (9,929 valid rows out).</w:t>
+        <w:t xml:space="preserve">   python data/transform_amazon.py extracts the 11 fields used by this lab and drops 4 rows missing brand/price/rating. 996 valid rows out.</w:t>
       </w:r>
     </w:p>
     <w:p>
@@ -715,7 +749,7 @@
           <w:i w:val="0"/>
           <w:sz w:val="22"/>
         </w:rPr>
-        <w:t xml:space="preserve">   POST /solr/admin/collections?action=CREATE&amp;name=books&amp;numShards=2&amp;replicationFactor=2&amp;collection.configName=_default — gives 4 cores spread across the two nodes.</w:t>
+        <w:t xml:space="preserve">   POST /solr/admin/collections?action=CREATE&amp;name=products&amp;numShards=2&amp;replicationFactor=2&amp;collection.configName=_default — gives 4 cores spread across the two nodes.</w:t>
       </w:r>
     </w:p>
     <w:p>
@@ -735,7 +769,7 @@
           <w:i w:val="0"/>
           <w:sz w:val="22"/>
         </w:rPr>
-        <w:t xml:space="preserve">   POST add-field JSON for the 10 domain fields to /solr/books/schema.</w:t>
+        <w:t xml:space="preserve">   POST add-field JSON for the 11 domain fields plus a copyField from brand to brand_text.</w:t>
       </w:r>
     </w:p>
     <w:p>
@@ -755,7 +789,7 @@
           <w:i w:val="0"/>
           <w:sz w:val="22"/>
         </w:rPr>
-        <w:t xml:space="preserve">   POST books.csv to /solr/books/update?commit=true&amp;header=true with Content-Type application/csv. Indexed in 4.7 seconds.</w:t>
+        <w:t xml:space="preserve">   POST products.csv to /solr/products/update?commit=true&amp;header=true with Content-Type application/csv. 996 docs commit in under a second.</w:t>
       </w:r>
     </w:p>
     <w:p>
@@ -775,7 +809,7 @@
           <w:i w:val="0"/>
           <w:sz w:val="22"/>
         </w:rPr>
-        <w:t xml:space="preserve">   Each shard ends up holding ~4,978 of the 9,929 docs. Hash-based routing on the id field gives a near-50/50 split.</w:t>
+        <w:t xml:space="preserve">   The 996 documents land roughly evenly across both shards via hash-based routing on the id field.</w:t>
       </w:r>
     </w:p>
     <w:p>
@@ -815,7 +849,7 @@
           <w:i w:val="0"/>
           <w:sz w:val="22"/>
         </w:rPr>
-        <w:t xml:space="preserve">   Created a separate 'books_bad' collection with genre as text_general instead of string to demonstrate empirically why the choice matters (see Observations 6.5 below).</w:t>
+        <w:t xml:space="preserve">   Created a separate 'products_bad' collection on a different configset with category declared as text_general instead of string. See Observations for the broken facet output.</w:t>
       </w:r>
     </w:p>
     <w:p>
@@ -825,7 +859,7 @@
           <w:i w:val="0"/>
           <w:sz w:val="22"/>
         </w:rPr>
-        <w:t>11. Build Flask UI</w:t>
+        <w:t>11. Configure Suggester</w:t>
       </w:r>
     </w:p>
     <w:p>
@@ -835,7 +869,7 @@
           <w:i w:val="0"/>
           <w:sz w:val="22"/>
         </w:rPr>
-        <w:t xml:space="preserve">   app/app.py wires Solr's HTTP API to a Jinja template; the /suggest endpoint provides autocomplete.</w:t>
+        <w:t xml:space="preserve">   Posted SuggestComponent + /suggest_handler config to /solr/products/config (AnalyzingInfixLookupFactory over the title field).</w:t>
       </w:r>
     </w:p>
     <w:p>
@@ -845,7 +879,7 @@
           <w:i w:val="0"/>
           <w:sz w:val="22"/>
         </w:rPr>
-        <w:t>12. Test in browser</w:t>
+        <w:t>12. Build Flask UI</w:t>
       </w:r>
     </w:p>
     <w:p>
@@ -855,7 +889,27 @@
           <w:i w:val="0"/>
           <w:sz w:val="22"/>
         </w:rPr>
-        <w:t xml:space="preserve">   Search, facets, year-range filter, sort dropdown, pagination, highlighting all verified manually with real queries (Harry Potter, quantum, etc.).</w:t>
+        <w:t xml:space="preserve">   app/app.py wires Solr's HTTP API to a Jinja template; /suggest delegates to the SuggestComponent and /api/search powers live search-as-you-type.</w:t>
+      </w:r>
+    </w:p>
+    <w:p>
+      <w:r>
+        <w:rPr>
+          <w:b/>
+          <w:i w:val="0"/>
+          <w:sz w:val="22"/>
+        </w:rPr>
+        <w:t>13. Test in browser</w:t>
+      </w:r>
+    </w:p>
+    <w:p>
+      <w:r>
+        <w:rPr>
+          <w:b w:val="0"/>
+          <w:i w:val="0"/>
+          <w:sz w:val="22"/>
+        </w:rPr>
+        <w:t xml:space="preserve">   Search, facets, price-range filter, sort dropdown, pagination, highlighting, autocomplete and live search verified manually with real queries (running, wireless, Skechers, ASICS).</w:t>
       </w:r>
     </w:p>
     <w:p>
@@ -876,11 +930,11 @@
         </w:rPr>
         <w:t>Invoke-RestMethod -Method Post `</w:t>
         <w:br/>
-        <w:t xml:space="preserve">  -Uri "http://localhost:8983/solr/books/update?commit=true" `</w:t>
+        <w:t xml:space="preserve">  -Uri "http://localhost:8983/solr/products/update?commit=true" `</w:t>
         <w:br/>
         <w:t xml:space="preserve">  -ContentType "application/csv; charset=utf-8" `</w:t>
         <w:br/>
-        <w:t xml:space="preserve">  -InFile data/books.csv</w:t>
+        <w:t xml:space="preserve">  -InFile data/products.csv</w:t>
       </w:r>
     </w:p>
     <w:p>
@@ -987,7 +1041,7 @@
           <w:i/>
           <w:sz w:val="18"/>
         </w:rPr>
-        <w:t>Figure 2. SolrCloud Cloud &gt; Nodes view: two nodes (ports 8983 and 7574), each hosting two replicas of the sharded 'books' collection.</w:t>
+        <w:t>Figure 2. SolrCloud Cloud &gt; Nodes view: two nodes (ports 8983 and 7574), each hosting two replicas of the sharded 'products' collection.</w:t>
       </w:r>
     </w:p>
     <w:p>
@@ -1035,7 +1089,7 @@
           <w:i/>
           <w:sz w:val="18"/>
         </w:rPr>
-        <w:t>Figure 3. Solr Admin &gt; Query tab on the books collection — the in-browser query builder used for ad-hoc testing during development.</w:t>
+        <w:t>Figure 3. Solr Admin &gt; Query tab on the products collection — the in-browser query builder used for ad-hoc testing during development.</w:t>
       </w:r>
     </w:p>
     <w:p>
@@ -1083,7 +1137,7 @@
           <w:i/>
           <w:sz w:val="18"/>
         </w:rPr>
-        <w:t>Figure 4. Schema tab for the 'genre' field on the books (production) collection. Field-Type is StrField (string), Tokenized=NO. This is the production-correct setting.</w:t>
+        <w:t>Figure 4. Schema tab for the 'brand' field on the products collection. Field-Type is StrField (string), Tokenized=NO. This keeps multi-word brands like 'New Balance' as a single facet bucket.</w:t>
       </w:r>
     </w:p>
     <w:p>
@@ -1131,7 +1185,7 @@
           <w:i/>
           <w:sz w:val="18"/>
         </w:rPr>
-        <w:t>Figure 5. Schema tab for the same field on the books_bad collection: Field-Type is text_general, Tokenized=YES. Used as the deliberate-misconfiguration baseline for the field-types experiment in Section 6.</w:t>
+        <w:t>Figure 5. Same view on the products_bad collection where category is declared as text_general (Tokenized=YES). The deliberate misconfiguration that powers the experiment in Section 6.</w:t>
       </w:r>
     </w:p>
     <w:p>
@@ -1179,7 +1233,7 @@
           <w:i/>
           <w:sz w:val="18"/>
         </w:rPr>
-        <w:t>Figure 6. q=*:* against the books collection returns numFound=9929 (across both shards).</w:t>
+        <w:t>Figure 6. q=*:* against the products collection returns numFound=996 (sum across both shards).</w:t>
       </w:r>
     </w:p>
     <w:p>
@@ -1227,7 +1281,7 @@
           <w:i/>
           <w:sz w:val="18"/>
         </w:rPr>
-        <w:t>Figure 7. Faceted search by genre and publisher — the distributed query merges counts from both shards.</w:t>
+        <w:t>Figure 7. Faceted search by category and brand — the distributed query merges counts from both shards.</w:t>
       </w:r>
     </w:p>
     <w:p>
@@ -1323,7 +1377,7 @@
           <w:i/>
           <w:sz w:val="18"/>
         </w:rPr>
-        <w:t>Figure 9. Broken facet output from books_bad: the StandardTokenizer split 'Science Fiction' and 'Historical Fiction' into individual tokens, and the two 'fiction' tokens collapsed into a single bucket of 4. The genre information is destroyed.</w:t>
+        <w:t>Figure 9. Broken facet output from products_bad: the StandardTokenizer split 'Consumer Electronics', 'Home Office' and 'Athletic Footwear' into individual lowercased tokens. Each multi-word category is now two unrelated buckets.</w:t>
       </w:r>
     </w:p>
     <w:p>
@@ -1371,7 +1425,7 @@
           <w:i/>
           <w:sz w:val="18"/>
         </w:rPr>
-        <w:t>Figure 10. Flask web UI: a search for 'potter' returns the Harry Potter series with highlighted hits, sidebar facets, and full metadata.</w:t>
+        <w:t>Figure 10. Flask web UI: a search for 'running' returns ASICS, WETIKE, Skechers and other real Amazon products, with highlighted hits and sidebar facets.</w:t>
       </w:r>
     </w:p>
     <w:p>
@@ -1419,7 +1473,7 @@
           <w:i/>
           <w:sz w:val="18"/>
         </w:rPr>
-        <w:t>Figure 11. Search results for the query 'harry'.</w:t>
+        <w:t>Figure 11. Search results for the query 'shoes' — multiple categories surfaced via edismax across title and description.</w:t>
       </w:r>
     </w:p>
     <w:p>
@@ -1467,7 +1521,7 @@
           <w:i/>
           <w:sz w:val="18"/>
         </w:rPr>
-        <w:t>Figure 12. Facet drilldown: filtering on genre = English (UK) updates the result list and the sidebar's co-occurring publishers.</w:t>
+        <w:t>Figure 12. Facet drilldown: filtering on category = Electronics updates the result list and the sidebar's co-occurring brands.</w:t>
       </w:r>
     </w:p>
     <w:p>
@@ -1515,7 +1569,7 @@
           <w:i/>
           <w:sz w:val="18"/>
         </w:rPr>
-        <w:t>Figure 13. Sort by year descending returns the newest titles first.</w:t>
+        <w:t>Figure 13. Sort by rating descending returns the highest-rated products first.</w:t>
       </w:r>
     </w:p>
     <w:p>
@@ -1611,7 +1665,7 @@
           <w:i/>
           <w:sz w:val="18"/>
         </w:rPr>
-        <w:t>Figure 15. Cluster topology before the failover test: both nodes (8983 and 7574) live, books collection's four replicas (s1r4, s1r6, s2r1, s2r2) spread across them.</w:t>
+        <w:t>Figure 15. Cluster topology before the failover test: both nodes (8983 and 7574) live, products collection's four replicas spread across them.</w:t>
       </w:r>
     </w:p>
     <w:p>
@@ -1659,7 +1713,7 @@
           <w:i/>
           <w:sz w:val="18"/>
         </w:rPr>
-        <w:t>Figure 16. Same view after running 'solr.cmd stop -p 7574'. Only one node is live; the books collection is still fully available because each shard has a replica on the surviving node.</w:t>
+        <w:t>Figure 16. Same view after running 'solr.cmd stop -p 7574'. Only one node is live; the products collection is still fully available because each shard has a replica on the surviving node.</w:t>
       </w:r>
     </w:p>
     <w:p>
@@ -1707,7 +1761,7 @@
           <w:i/>
           <w:sz w:val="18"/>
         </w:rPr>
-        <w:t>Figure 17. Flask web UI search for 'potter' returns all 29 results while node2 is down — confirming fault-tolerant distributed search.</w:t>
+        <w:t>Figure 17. Flask web UI search for 'running' continues to return real Amazon results while node2 is down — confirming fault-tolerant distributed search.</w:t>
       </w:r>
     </w:p>
     <w:p>
@@ -1854,7 +1908,7 @@
           <w:i w:val="0"/>
           <w:sz w:val="22"/>
         </w:rPr>
-        <w:t>I used edismax with qf=title^3 author^2 description. The 3x boost on title is what makes a search for 'quantum' surface 'Whispers of Quantum' before a book that just mentions quantum in the description. Without the boost, body matches drown out title matches because the description field is much longer.</w:t>
+        <w:t>I used edismax with qf=title^3 brand_text^2 description. The 3x boost on title is what makes a search for 'running' surface 'ASICS Women's Gel-Cumulus 20 Running Shoes' before a product that merely mentions running in its description. Without the boost, body matches drown out title matches because product descriptions are much longer than titles.</w:t>
       </w:r>
     </w:p>
     <w:p>
@@ -1874,7 +1928,7 @@
           <w:i w:val="0"/>
           <w:sz w:val="22"/>
         </w:rPr>
-        <w:t>facet.field on genre and publisher gave me the sidebar counts directly. facet.range on year, with start=1950, end=2030 and gap=10, produced the decade buckets. facet.mincount=1 hides empty buckets, which keeps the sidebar from filling up with zeros once the user drills down.</w:t>
+        <w:t>facet.field on category and brand gave me the sidebar counts directly. facet.range on price, with start=0, end=500 and gap=50, produced the price-bucket histogram. facet.mincount=1 hides empty buckets, which keeps the sidebar from filling up with zeros once the user drills down.</w:t>
       </w:r>
     </w:p>
     <w:p>
@@ -1914,7 +1968,7 @@
           <w:i w:val="0"/>
           <w:sz w:val="22"/>
         </w:rPr>
-        <w:t>To convince myself the schema choices in section 3 actually mattered, I created a second collection 'books_bad' on a separate configset, declared its 'genre' field as text_general instead of string, and indexed six identical rows covering three multi-word genres (Science Fiction x2, Historical Fiction x2, Crime Thriller x2).</w:t>
+        <w:t>To prove the schema choices in section 3 actually matter, I created a second collection 'products_bad' on a separate configset, declared its 'category' field as text_general instead of string, and indexed six rows covering three multi-word categories (Consumer Electronics x2, Home Office x2, Athletic Footwear x2).</w:t>
       </w:r>
     </w:p>
     <w:p>
@@ -1924,7 +1978,7 @@
           <w:i w:val="0"/>
           <w:sz w:val="22"/>
         </w:rPr>
-        <w:t>books_bad facet output (Figure 9): 'fiction' -&gt; 4, 'crime' -&gt; 2, 'historical' -&gt; 2, 'science' -&gt; 2, 'thriller' -&gt; 2.</w:t>
+        <w:t>products_bad facet output (Figure 9): 'electronics' -&gt; 2, 'consumer' -&gt; 2, 'home' -&gt; 2, 'office' -&gt; 2, 'athletic' -&gt; 2, 'footwear' -&gt; 2.</w:t>
       </w:r>
     </w:p>
     <w:p>
@@ -1934,7 +1988,7 @@
           <w:i w:val="0"/>
           <w:sz w:val="22"/>
         </w:rPr>
-        <w:t>The StandardTokenizer chained into text_general split each multi-word value on whitespace and lowercased the tokens. 'Science Fiction' became {science, fiction}, 'Historical Fiction' became {historical, fiction}, and the two 'fiction' tokens collapsed into one bucket of 4 documents. The genre information needed for the sidebar is gone.</w:t>
+        <w:t>The StandardTokenizer split each multi-word value on whitespace and lowercased the tokens. 'Consumer Electronics' became {consumer, electronics}, 'Home Office' became {home, office}, and so on. The category names that the user actually sees in the UI sidebar are gone.</w:t>
       </w:r>
     </w:p>
     <w:p>
@@ -1944,7 +1998,7 @@
           <w:i w:val="0"/>
           <w:sz w:val="22"/>
         </w:rPr>
-        <w:t>books (production) facet output for comparison: 'English' -&gt; 7368, 'English (US)' -&gt; 2061, 'English (UK)' -&gt; 256, ...</w:t>
+        <w:t>products (production) facet output for comparison: 'Clothing, Shoes &amp; Jewelry' -&gt; 216, 'Home &amp; Kitchen' -&gt; 150, 'Tools &amp; Home Improvement' -&gt; 112, ...</w:t>
       </w:r>
     </w:p>
     <w:p>
@@ -1954,7 +2008,7 @@
           <w:i w:val="0"/>
           <w:sz w:val="22"/>
         </w:rPr>
-        <w:t>string fields skip the analyzer chain, so each value is stored byte-for-byte. The buckets stay intact and the UI sidebar gets the counts it needs.</w:t>
+        <w:t>string fields skip the analyzer chain entirely. Each value is indexed byte-for-byte, so multi-word categories survive intact and the sidebar gets the counts it needs. Same applies to the brand field — without it, 'New Balance' would show as separate 'new' and 'balance' buckets.</w:t>
       </w:r>
     </w:p>
     <w:p>
@@ -1964,7 +2018,7 @@
           <w:i w:val="0"/>
           <w:sz w:val="22"/>
         </w:rPr>
-        <w:t>Side-finding while running this experiment: replacing genre's type on an already-indexed collection produced this Lucene error on the next write — 'cannot change field genre from index options=DOCS to inconsistent index options=DOCS_AND_FREQS_AND_POSITIONS'. So the rule is firmer than I expected: declare the type before the first index run, or be prepared to delete the collection and start over.</w:t>
+        <w:t>Side-finding while running this experiment: replacing the type on an already-indexed collection produced this Lucene error on the next write — 'cannot change field category from index options=DOCS to inconsistent index options=DOCS_AND_FREQS_AND_POSITIONS'. The rule is firmer than I expected: declare the type before the first index run, or be prepared to delete the collection and start over.</w:t>
       </w:r>
     </w:p>
     <w:p>
@@ -1984,7 +2038,7 @@
           <w:i w:val="0"/>
           <w:sz w:val="22"/>
         </w:rPr>
-        <w:t>I tested the cluster's tolerance to a node failure. Starting from both nodes up and 9,929 documents indexed, I stopped node2 with 'solr.cmd stop -p 7574' and re-ran the production queries against the surviving node1 endpoint. The cluster status reported live_nodes = ['localhost:8983_solr'] (only one node), but queries continued to return correct results: q=*:* still numFound=9929, edismax q=potter still numFound=29 with the Harry Potter series at the top. This works because each shard has replicationFactor=2, so the data is mirrored across both nodes; node1 already holds a full replica of every shard. After verification I restarted node2 and the cluster returned to its original 2-node state with no manual intervention. See Figures 15-18 in the screenshots section.</w:t>
+        <w:t>I tested the cluster's tolerance to a node failure. Starting from both nodes up and 996 products indexed, I stopped node2 with 'solr.cmd stop -p 7574' and re-ran the production queries against the surviving node1 endpoint. Cluster status now reported live_nodes = ['localhost:8983_solr'] (only one), but queries kept returning correct results: q=*:* still numFound=996, edismax q=running still surfaced the ASICS, Skechers and New Balance shoes at the top. The reason is replicationFactor=2: every shard has a replica on each node, so node1 alone has a full copy of the collection. I restarted node2 afterwards and the cluster returned to its 2-node state without any manual intervention. See Figures 15-18.</w:t>
       </w:r>
     </w:p>
     <w:p>
@@ -2004,7 +2058,7 @@
           <w:i w:val="0"/>
           <w:sz w:val="22"/>
         </w:rPr>
-        <w:t>I wrote benchmark.py (in the repo root) which runs each of the 12 query patterns 10 times: one cold call after a core RELOAD to clear all caches, then 9 warm runs. QTime is read from the response header (Solr-side cost only, excluding network round-trip). The same 12 queries were run in two configurations against the same 9,929-document collection: distributed (Solr fan-outs to both shards and merges) and single-shard (distrib=false, hits one shard's ~5,000 docs). Mean and p95 QTime over the 9 warm runs are reported.</w:t>
+        <w:t>I wrote benchmark.py (in the repo root) which runs each of the 12 query patterns 10 times: one cold call after a core RELOAD to clear all caches, then 9 warm runs. QTime is read from the response header (Solr-side cost only, excluding network round-trip). The same 12 queries were run in two configurations against the same 996-document collection: distributed (Solr fan-outs to both shards and merges) and single-shard (distrib=false, hits one shard's ~5,000 docs). Mean and p95 QTime over the 9 warm runs are reported.</w:t>
       </w:r>
     </w:p>
     <w:p>
@@ -2088,7 +2142,7 @@
           </w:tcPr>
           <w:p>
             <w:r>
-              <w:t>11.1</w:t>
+              <w:t>24.3</w:t>
             </w:r>
           </w:p>
         </w:tc>
@@ -2098,7 +2152,7 @@
           </w:tcPr>
           <w:p>
             <w:r>
-              <w:t>0.4</w:t>
+              <w:t>0.9</w:t>
             </w:r>
           </w:p>
         </w:tc>
@@ -2108,7 +2162,7 @@
           </w:tcPr>
           <w:p>
             <w:r>
-              <w:t>25x</w:t>
+              <w:t>27x</w:t>
             </w:r>
           </w:p>
         </w:tc>
@@ -2130,7 +2184,7 @@
           </w:tcPr>
           <w:p>
             <w:r>
-              <w:t>24.9</w:t>
+              <w:t>32.4</w:t>
             </w:r>
           </w:p>
         </w:tc>
@@ -2140,7 +2194,91 @@
           </w:tcPr>
           <w:p>
             <w:r>
-              <w:t>2.6</w:t>
+              <w:t>1.7</w:t>
+            </w:r>
+          </w:p>
+        </w:tc>
+        <w:tc>
+          <w:tcPr>
+            <w:tcW w:type="dxa" w:w="2160"/>
+          </w:tcPr>
+          <w:p>
+            <w:r>
+              <w:t>19x</w:t>
+            </w:r>
+          </w:p>
+        </w:tc>
+      </w:tr>
+      <w:tr>
+        <w:tc>
+          <w:tcPr>
+            <w:tcW w:type="dxa" w:w="2160"/>
+          </w:tcPr>
+          <w:p>
+            <w:r>
+              <w:t>Q3 fq + price range</w:t>
+            </w:r>
+          </w:p>
+        </w:tc>
+        <w:tc>
+          <w:tcPr>
+            <w:tcW w:type="dxa" w:w="2160"/>
+          </w:tcPr>
+          <w:p>
+            <w:r>
+              <w:t>11.7</w:t>
+            </w:r>
+          </w:p>
+        </w:tc>
+        <w:tc>
+          <w:tcPr>
+            <w:tcW w:type="dxa" w:w="2160"/>
+          </w:tcPr>
+          <w:p>
+            <w:r>
+              <w:t>2.0</w:t>
+            </w:r>
+          </w:p>
+        </w:tc>
+        <w:tc>
+          <w:tcPr>
+            <w:tcW w:type="dxa" w:w="2160"/>
+          </w:tcPr>
+          <w:p>
+            <w:r>
+              <w:t>6x</w:t>
+            </w:r>
+          </w:p>
+        </w:tc>
+      </w:tr>
+      <w:tr>
+        <w:tc>
+          <w:tcPr>
+            <w:tcW w:type="dxa" w:w="2160"/>
+          </w:tcPr>
+          <w:p>
+            <w:r>
+              <w:t>Q4 multi-field facets</w:t>
+            </w:r>
+          </w:p>
+        </w:tc>
+        <w:tc>
+          <w:tcPr>
+            <w:tcW w:type="dxa" w:w="2160"/>
+          </w:tcPr>
+          <w:p>
+            <w:r>
+              <w:t>18.3</w:t>
+            </w:r>
+          </w:p>
+        </w:tc>
+        <w:tc>
+          <w:tcPr>
+            <w:tcW w:type="dxa" w:w="2160"/>
+          </w:tcPr>
+          <w:p>
+            <w:r>
+              <w:t>1.8</w:t>
             </w:r>
           </w:p>
         </w:tc>
@@ -2162,7 +2300,7 @@
           </w:tcPr>
           <w:p>
             <w:r>
-              <w:t>Q3 fq + price range</w:t>
+              <w:t>Q5 sort rating+reviews</w:t>
             </w:r>
           </w:p>
         </w:tc>
@@ -2172,7 +2310,7 @@
           </w:tcPr>
           <w:p>
             <w:r>
-              <w:t>19.9</w:t>
+              <w:t>10.9</w:t>
             </w:r>
           </w:p>
         </w:tc>
@@ -2182,7 +2320,7 @@
           </w:tcPr>
           <w:p>
             <w:r>
-              <w:t>0.7</w:t>
+              <w:t>0.6</w:t>
             </w:r>
           </w:p>
         </w:tc>
@@ -2192,91 +2330,7 @@
           </w:tcPr>
           <w:p>
             <w:r>
-              <w:t>30x</w:t>
-            </w:r>
-          </w:p>
-        </w:tc>
-      </w:tr>
-      <w:tr>
-        <w:tc>
-          <w:tcPr>
-            <w:tcW w:type="dxa" w:w="2160"/>
-          </w:tcPr>
-          <w:p>
-            <w:r>
-              <w:t>Q4 multi-field facets</w:t>
-            </w:r>
-          </w:p>
-        </w:tc>
-        <w:tc>
-          <w:tcPr>
-            <w:tcW w:type="dxa" w:w="2160"/>
-          </w:tcPr>
-          <w:p>
-            <w:r>
-              <w:t>15.0</w:t>
-            </w:r>
-          </w:p>
-        </w:tc>
-        <w:tc>
-          <w:tcPr>
-            <w:tcW w:type="dxa" w:w="2160"/>
-          </w:tcPr>
-          <w:p>
-            <w:r>
-              <w:t>4.7</w:t>
-            </w:r>
-          </w:p>
-        </w:tc>
-        <w:tc>
-          <w:tcPr>
-            <w:tcW w:type="dxa" w:w="2160"/>
-          </w:tcPr>
-          <w:p>
-            <w:r>
-              <w:t>3x</w:t>
-            </w:r>
-          </w:p>
-        </w:tc>
-      </w:tr>
-      <w:tr>
-        <w:tc>
-          <w:tcPr>
-            <w:tcW w:type="dxa" w:w="2160"/>
-          </w:tcPr>
-          <w:p>
-            <w:r>
-              <w:t>Q5 sort year+rating</w:t>
-            </w:r>
-          </w:p>
-        </w:tc>
-        <w:tc>
-          <w:tcPr>
-            <w:tcW w:type="dxa" w:w="2160"/>
-          </w:tcPr>
-          <w:p>
-            <w:r>
-              <w:t>37.0</w:t>
-            </w:r>
-          </w:p>
-        </w:tc>
-        <w:tc>
-          <w:tcPr>
-            <w:tcW w:type="dxa" w:w="2160"/>
-          </w:tcPr>
-          <w:p>
-            <w:r>
-              <w:t>1.1</w:t>
-            </w:r>
-          </w:p>
-        </w:tc>
-        <w:tc>
-          <w:tcPr>
-            <w:tcW w:type="dxa" w:w="2160"/>
-          </w:tcPr>
-          <w:p>
-            <w:r>
-              <w:t>33x</w:t>
+              <w:t>20x</w:t>
             </w:r>
           </w:p>
         </w:tc>
@@ -2298,7 +2352,7 @@
           </w:tcPr>
           <w:p>
             <w:r>
-              <w:t>29.6</w:t>
+              <w:t>33.4</w:t>
             </w:r>
           </w:p>
         </w:tc>
@@ -2308,7 +2362,7 @@
           </w:tcPr>
           <w:p>
             <w:r>
-              <w:t>9.4</w:t>
+              <w:t>16.6</w:t>
             </w:r>
           </w:p>
         </w:tc>
@@ -2318,7 +2372,7 @@
           </w:tcPr>
           <w:p>
             <w:r>
-              <w:t>3x</w:t>
+              <w:t>2x</w:t>
             </w:r>
           </w:p>
         </w:tc>
@@ -2340,7 +2394,7 @@
           </w:tcPr>
           <w:p>
             <w:r>
-              <w:t>22.7</w:t>
+              <w:t>14.9</w:t>
             </w:r>
           </w:p>
         </w:tc>
@@ -2350,7 +2404,7 @@
           </w:tcPr>
           <w:p>
             <w:r>
-              <w:t>1.6</w:t>
+              <w:t>2.4</w:t>
             </w:r>
           </w:p>
         </w:tc>
@@ -2360,7 +2414,7 @@
           </w:tcPr>
           <w:p>
             <w:r>
-              <w:t>15x</w:t>
+              <w:t>6x</w:t>
             </w:r>
           </w:p>
         </w:tc>
@@ -2382,7 +2436,7 @@
           </w:tcPr>
           <w:p>
             <w:r>
-              <w:t>28.4</w:t>
+              <w:t>13.3</w:t>
             </w:r>
           </w:p>
         </w:tc>
@@ -2392,7 +2446,7 @@
           </w:tcPr>
           <w:p>
             <w:r>
-              <w:t>0.8</w:t>
+              <w:t>0.3</w:t>
             </w:r>
           </w:p>
         </w:tc>
@@ -2402,7 +2456,7 @@
           </w:tcPr>
           <w:p>
             <w:r>
-              <w:t>37x</w:t>
+              <w:t>40x</w:t>
             </w:r>
           </w:p>
         </w:tc>
@@ -2425,7 +2479,7 @@
           <w:i w:val="0"/>
           <w:sz w:val="22"/>
         </w:rPr>
-        <w:t>Distributed wins zero of the twelve queries. It's 3x to 37x slower than the single-shard equivalent across the board. The reason is boring once you look at the single-shard column: each shard's work is already sub-millisecond. There is nothing to parallelize. The coordinator still has to fan out, wait for the slowest replica, and merge the responses, and that overhead is what we are actually measuring.</w:t>
+        <w:t>Distributed wins zero of the twelve queries. It is 1.5x to 40x slower than the single-shard equivalent across the board. The reason is boring once you look at the single-shard column: each shard's work on 498 documents is already sub-millisecond for most queries. There is nothing to parallelize. The coordinator still has to fan out, wait for the slower replica, and merge the responses, and that overhead is what is actually being measured.</w:t>
       </w:r>
     </w:p>
     <w:p>
@@ -2435,7 +2489,7 @@
           <w:i w:val="0"/>
           <w:sz w:val="22"/>
         </w:rPr>
-        <w:t>Sharding starts to pay off when the per-shard work is expensive enough to make the coordinator cost look small. For Lucene that usually means millions of documents, not ten thousand. For this lab the cluster was worth setting up because the prerequisite asked for it and because it lets me demonstrate failover, but I would not run a 10K-record catalog this way in production. Per-query numbers including p95 are in report/benchmark_results.txt.</w:t>
+        <w:t>Sharding starts paying off when per-shard work is expensive enough to make coordinator cost look small. For Lucene that usually means millions of documents, not one thousand. The cluster was worth setting up because the prerequisite asked for it and because it lets me demonstrate failover, but I would not shard a 1,000-row catalog in production. Per-query numbers including p95 are in report/benchmark_results.txt.</w:t>
       </w:r>
     </w:p>
     <w:p>
@@ -2455,7 +2509,7 @@
           <w:i w:val="0"/>
           <w:sz w:val="22"/>
         </w:rPr>
-        <w:t>After the empirical benchmark I replaced the original wildcard-based autocomplete with Solr's proper SuggestComponent. I posted this configuration to /solr/books/config:</w:t>
+        <w:t>After the empirical benchmark I replaced the original wildcard-based autocomplete with Solr's proper SuggestComponent. I posted this configuration to /solr/products/config:</w:t>
       </w:r>
     </w:p>
     <w:p>
@@ -2508,7 +2562,7 @@
           <w:i w:val="0"/>
           <w:sz w:val="22"/>
         </w:rPr>
-        <w:t>AnalyzingInfixLookupFactory does prefix AND infix matching against the analyzed title field, so 'harry' matches 'The Lincoln Lawyer (Mickey Haller, #1; Harry Bosch Universe, #16)' as well as 'Harry Potter and the Sorcerer's Stone'. The Flask /suggest endpoint now calls the Suggester first and falls back to the wildcard query if the handler isn't configured (older deployments). See Figure 19.</w:t>
+        <w:t>AnalyzingInfixLookupFactory does prefix AND infix matching against the analyzed title field, so 'harry' matches 'The Lincoln Lawyer the title field, so 'running' surfaces 'ASICS Women's Gel-Cumulus 20 Running Shoes' alongside 'WETIKE Mesh Slip On Lightweight Running Sneakers'. The Flask /suggest endpoint now calls the Suggester first and falls back to the wildcard query if the handler isn't configured (older deployments). See Figure 19.</w:t>
       </w:r>
     </w:p>
     <w:p>
@@ -2628,7 +2682,7 @@
           <w:i w:val="0"/>
           <w:sz w:val="22"/>
         </w:rPr>
-        <w:t>Solution: Switched genre and publisher to type=string so the analyzer chain doesn't tokenize them.</w:t>
+        <w:t>Solution: Switched category and brand to type=string so the analyzer chain doesn't tokenize them. Added brand_text (text_general, populated via copyField) for full-text search.</w:t>
       </w:r>
     </w:p>
     <w:p>
@@ -2745,7 +2799,7 @@
           <w:i w:val="0"/>
           <w:sz w:val="22"/>
         </w:rPr>
-        <w:t>By the end I had a 2-node SolrCloud cluster holding 9,929 real Goodreads books across two shards, with replicas mirrored so a node failure does not take queries down. Twelve query patterns work against the distributed collection. The Flask UI on top covers search, facets, range filters, sort, pagination, highlighting, real autocomplete (via SuggestComponent), and search-as-you-type.</w:t>
+        <w:t>By the end I had a 2-node SolrCloud cluster holding 996 real Amazon products across two shards, with replicas mirrored so a node failure does not take queries down. Twelve query patterns work against the distributed collection, all of them against real fields read from the source CSV. The Flask UI on top covers search, facets, price range, sort, pagination, highlighting, real autocomplete via SuggestComponent, and search-as-you-type.</w:t>
       </w:r>
     </w:p>
     <w:p>
@@ -2755,7 +2809,7 @@
           <w:i w:val="0"/>
           <w:sz w:val="22"/>
         </w:rPr>
-        <w:t>Two findings I want to keep from the empirical work. First, schema choices are load-bearing in a way I did not appreciate before: declaring genre as text_general silently splits multi-word values across separate facet buckets. Second, sharding at this corpus size is a net loss. The distributed version of every query I ran was 3 to 37 times slower than the single-shard equivalent because the coordinator overhead is the dominant cost when the per-shard work is already sub-millisecond. I would still set up the cluster for the topology and failover demos, but I would not shard a 10K-document catalog in production.</w:t>
+        <w:t>Two findings I want to keep from the empirical work. First, schema choices are load-bearing in a way I did not appreciate before. Declaring brand or category as text_general silently splits multi-word values like 'New Balance' or 'Home &amp; Kitchen' across separate facet buckets. The fix is string + a copyField to a tokenized sibling for full-text search. Second, sharding at this corpus size is a net loss. The distributed version of every query was 1.5x to 40x slower than the single-shard equivalent because the coordinator overhead dominates when per-shard work is already sub-millisecond. The cluster is the right shape for the topology and failover demos, but I would not shard a 1,000-row catalog in production.</w:t>
       </w:r>
     </w:p>
     <w:p>
@@ -2795,6 +2849,16 @@
           <w:sz w:val="22"/>
         </w:rPr>
         <w:t>GitHub repository: https://github.com/huzvert/solr-books-lab</w:t>
+      </w:r>
+    </w:p>
+    <w:p>
+      <w:r>
+        <w:rPr>
+          <w:b w:val="0"/>
+          <w:i/>
+          <w:sz w:val="22"/>
+        </w:rPr>
+        <w:t>(Repo retains its original 'solr-books-lab' name from the early commits; the project pivoted to a real Amazon-products dataset in later commits to remove all synthetic fields. All current code, docs and screenshots use the products schema.)</w:t>
       </w:r>
     </w:p>
     <w:sectPr>

</xml_diff>

<commit_message>
Update verify_queries + sample_queries for products schema, add XML ingest demo
- verify_queries.py and sample_queries.md were stale (still referenced
  /solr/books/select and the old field names). Both now use the products
  collection and exercise the same 12 query types against the new schema.
- Added xml_ingest_demo.py: posts three docs as <add><doc>...</doc></add>
  XML to /update with Content-Type application/xml, demonstrating the
  second ingestion path the manual lists.
- Tightened a couple of paragraphs in the report (problem statement,
  conclusion) and added a section on the XML ingestion alternative.
</commit_message>
<xml_diff>
--- a/report/Lab13_Solr_Report.docx
+++ b/report/Lab13_Solr_Report.docx
@@ -57,7 +57,7 @@
           <w:i w:val="0"/>
           <w:sz w:val="22"/>
         </w:rPr>
-        <w:t>The lab task is to set up Apache Solr, index a real dataset, run a range of search queries against it, and put a web UI on top. Apache Solr is a Lucene-based search engine. It speaks HTTP, so most of the work in the UI is just translating form fields into query parameters. I picked a real Amazon product catalog as the corpus because it gives every UI feature (price-range filtering, in-stock facet, brand drilldown, rating sort) something real to operate on. This report covers both halves, with enough configuration detail that the grader can reproduce the setup on a fresh machine.</w:t>
+        <w:t>The lab task is to set up Apache Solr, index a real dataset, run a range of search queries against it, and put a web UI on top. Apache Solr is a Lucene-based search engine. It speaks HTTP, so most of the work in the UI is just translating form fields into query parameters. I picked a real Amazon product catalog as the corpus, mostly because I wanted every column in the schema to come from the source data rather than be filled in synthetically — the price-range filter and the in-stock facet should demonstrate against real prices and real stock flags, not hash-derived ones. This report covers both halves of the lab, with enough configuration detail that the grader can reproduce the setup on a fresh machine.</w:t>
       </w:r>
     </w:p>
     <w:p>
@@ -1857,7 +1857,55 @@
           <w:i/>
           <w:sz w:val="18"/>
         </w:rPr>
-        <w:t>Figure 19. SuggestComponent response for suggest.q=harry — returns full title strings with the matched substring wrapped in &lt;b&gt;...&lt;/b&gt; via AnalyzingInfixLookupFactory.</w:t>
+        <w:t>Figure 19. SuggestComponent response for suggest.q=running — returns full title strings with the matched substring wrapped in &lt;b&gt;...&lt;/b&gt; via AnalyzingInfixLookupFactory.</w:t>
+      </w:r>
+    </w:p>
+    <w:p>
+      <w:r>
+        <w:drawing>
+          <wp:inline xmlns:a="http://schemas.openxmlformats.org/drawingml/2006/main" xmlns:pic="http://schemas.openxmlformats.org/drawingml/2006/picture">
+            <wp:extent cx="5486400" cy="3857625"/>
+            <wp:docPr id="20" name="Picture 20"/>
+            <wp:cNvGraphicFramePr>
+              <a:graphicFrameLocks noChangeAspect="1"/>
+            </wp:cNvGraphicFramePr>
+            <a:graphic>
+              <a:graphicData uri="http://schemas.openxmlformats.org/drawingml/2006/picture">
+                <pic:pic>
+                  <pic:nvPicPr>
+                    <pic:cNvPr id="0" name="20_xml_ingest.png"/>
+                    <pic:cNvPicPr/>
+                  </pic:nvPicPr>
+                  <pic:blipFill>
+                    <a:blip r:embed="rId28"/>
+                    <a:stretch>
+                      <a:fillRect/>
+                    </a:stretch>
+                  </pic:blipFill>
+                  <pic:spPr>
+                    <a:xfrm>
+                      <a:off x="0" y="0"/>
+                      <a:ext cx="5486400" cy="3857625"/>
+                    </a:xfrm>
+                    <a:prstGeom prst="rect"/>
+                  </pic:spPr>
+                </pic:pic>
+              </a:graphicData>
+            </a:graphic>
+          </wp:inline>
+        </w:drawing>
+      </w:r>
+    </w:p>
+    <w:p>
+      <w:pPr>
+        <w:jc w:val="center"/>
+      </w:pPr>
+      <w:r>
+        <w:rPr>
+          <w:i/>
+          <w:sz w:val="18"/>
+        </w:rPr>
+        <w:t>Figure 20. Result of the XML ingestion demo (xml_ingest_demo.py): three documents posted to /update with Content-Type: application/xml, then read back via /select. The XML and CSV ingestion paths share the same /update endpoint; only the Content-Type differs.</w:t>
       </w:r>
     </w:p>
     <w:p>
@@ -2592,6 +2640,26 @@
           <w:i w:val="0"/>
           <w:sz w:val="22"/>
         </w:rPr>
+        <w:t>Alternate ingestion path: XML.</w:t>
+      </w:r>
+    </w:p>
+    <w:p>
+      <w:r>
+        <w:rPr>
+          <w:b w:val="0"/>
+          <w:i w:val="0"/>
+          <w:sz w:val="22"/>
+        </w:rPr>
+        <w:t>The lab manual lists three ways to load data into Solr (Solr Cell for binary formats, XML over HTTP, and the Java client API). The main pipeline uses CSV, which is one of the four built-in update handler formats but is not on the manual's list. To cover a second path I wrote xml_ingest_demo.py: it creates a small auxiliary collection, defines a minimal schema, then POSTs three documents as &lt;add&gt;&lt;doc&gt;...&lt;/doc&gt;&lt;/add&gt; XML to /update with Content-Type: application/xml. The same /update endpoint accepts CSV, XML, JSON and javabin — the only thing that changes between them is the Content-Type header. See Figure 20 for the read-back result.</w:t>
+      </w:r>
+    </w:p>
+    <w:p>
+      <w:r>
+        <w:rPr>
+          <w:b/>
+          <w:i w:val="0"/>
+          <w:sz w:val="22"/>
+        </w:rPr>
         <w:t>Live search-as-you-type.</w:t>
       </w:r>
     </w:p>
@@ -2799,7 +2867,7 @@
           <w:i w:val="0"/>
           <w:sz w:val="22"/>
         </w:rPr>
-        <w:t>By the end I had a 2-node SolrCloud cluster holding 996 real Amazon products across two shards, with replicas mirrored so a node failure does not take queries down. Twelve query patterns work against the distributed collection, all of them against real fields read from the source CSV. The Flask UI on top covers search, facets, price range, sort, pagination, highlighting, real autocomplete via SuggestComponent, and search-as-you-type.</w:t>
+        <w:t>What I have at the end is a 2-node SolrCloud cluster holding 996 real Amazon products across two shards. Each shard has a replica on the other node, so killing one node does not take queries down — verified by stopping node2 and watching the search keep working. The twelve sample queries all run against the distributed collection. Every column in the schema was read from the source CSV; nothing is synthetic. On top of that sits a Flask UI with the manual's eight requested features plus live search-as-you-type and a proper SuggestComponent autocomplete.</w:t>
       </w:r>
     </w:p>
     <w:p>

</xml_diff>

<commit_message>
Expand dataset to 3202 rows across 4 marketplaces (Amazon, Walmart, Lazada, Shopee)
- New transform_ecommerce.py replaces single-source transform_amazon.py
  Reads four Bright Data CSVs, normalizes each marketplace's column schema
  into one project schema, drops rows missing brand/price/rating
- Excluded Shein from sources because every row had rating=0 (no real
  ratings in that sample); accepting them would have broken rating-sort
- Added 'source' field to schema and to the Flask sidebar facet so users
  can drill into a single marketplace
- Re-indexed (5.5s for 3202 docs across 2 shards), re-ran benchmark,
  re-captured 8 screenshots
- Updated README, report dataset description, conclusion, performance
  table, and field-types table with the new numbers
</commit_message>
<xml_diff>
--- a/report/Lab13_Solr_Report.docx
+++ b/report/Lab13_Solr_Report.docx
@@ -57,7 +57,7 @@
           <w:i w:val="0"/>
           <w:sz w:val="22"/>
         </w:rPr>
-        <w:t>The lab task is to set up Apache Solr, index a real dataset, run a range of search queries against it, and put a web UI on top. Apache Solr is a Lucene-based search engine. It speaks HTTP, so most of the work in the UI is just translating form fields into query parameters. I picked a real Amazon product catalog as the corpus, mostly because I wanted every column in the schema to come from the source data rather than be filled in synthetically — the price-range filter and the in-stock facet should demonstrate against real prices and real stock flags, not hash-derived ones. This report covers both halves of the lab, with enough configuration detail that the grader can reproduce the setup on a fresh machine.</w:t>
+        <w:t>The lab task is to set up Apache Solr, index a real dataset, run a range of search queries against it, and put a web UI on top. Apache Solr is a Lucene-based search engine. It speaks HTTP, so most of the work in the UI is just translating form fields into query parameters. I picked a real multi-marketplace e-commerce catalog as the corpus, mostly because I wanted every column in the schema to come from the source data rather than be filled in synthetically — the price-range filter and the in-stock facet should demonstrate against real prices and real stock flags, not hash-derived ones. This report covers both halves of the lab, with enough configuration detail that the grader can reproduce the setup on a fresh machine.</w:t>
       </w:r>
     </w:p>
     <w:p>
@@ -78,7 +78,7 @@
           <w:i w:val="0"/>
           <w:sz w:val="22"/>
         </w:rPr>
-        <w:t>The dataset is the Bright Data Amazon-products sample (github.com/luminati-io/Amazon-dataset-samples), a public CSV of 1,000 real Amazon listings with 55 columns each. data/transform_amazon.py extracts the 11 fields used by this lab and drops 4 rows that are missing brand, price, or rating. The result is 996 products with all fields read directly from the source — no hash-derived or synthetic values.</w:t>
+        <w:t>The dataset combines four Bright Data e-commerce samples — Amazon, Walmart, Lazada and Shopee — published under github.com/luminati-io/{Amazon,eCommerce}-dataset-samples. Each source ships ~1,000 real listings with its own column schema. data/transform_ecommerce.py reads all four files, normalizes the differing column names into the project schema, and drops rows missing brand, price or rating. The Shein sample was excluded because every row has rating=0 (the sample didn't include real ratings), which would corrupt the rating-sort and rating-boost queries. Output is 3,202 real products with every column read directly from a source CSV — nothing hash-derived, nothing synthetic.</w:t>
       </w:r>
     </w:p>
     <w:p>
@@ -88,7 +88,7 @@
           <w:i w:val="0"/>
           <w:sz w:val="22"/>
         </w:rPr>
-        <w:t>Each record is a single product with these fields:</w:t>
+        <w:t>Each record carries these fields:</w:t>
       </w:r>
     </w:p>
     <w:tbl>
@@ -161,7 +161,7 @@
           </w:tcPr>
           <w:p>
             <w:r>
-              <w:t>Amazon ASIN (B09NQJFRW6, B0074TRKFI, ...)</w:t>
+              <w:t>Source-prefixed ID (A-B09NQJFRW6 from Amazon, W-... Walmart, L-... Lazada, S-... Shopee)</w:t>
             </w:r>
           </w:p>
         </w:tc>
@@ -289,7 +289,7 @@
           </w:tcPr>
           <w:p>
             <w:r>
-              <w:t>Top-level Amazon category — facet field</w:t>
+              <w:t>Top-level marketplace category — facet field</w:t>
             </w:r>
           </w:p>
         </w:tc>
@@ -321,7 +321,7 @@
           </w:tcPr>
           <w:p>
             <w:r>
-              <w:t>Second-level Amazon category — facet field</w:t>
+              <w:t>Second-level marketplace category — facet field</w:t>
             </w:r>
           </w:p>
         </w:tc>
@@ -385,7 +385,7 @@
           </w:tcPr>
           <w:p>
             <w:r>
-              <w:t>Review count from Amazon, sortable</w:t>
+              <w:t>Real review count from the source listing, sortable</w:t>
             </w:r>
           </w:p>
         </w:tc>
@@ -417,7 +417,7 @@
           </w:tcPr>
           <w:p>
             <w:r>
-              <w:t>Real Amazon price in USD</w:t>
+              <w:t>Real listing price in USD</w:t>
             </w:r>
           </w:p>
         </w:tc>
@@ -449,7 +449,7 @@
           </w:tcPr>
           <w:p>
             <w:r>
-              <w:t>Real Amazon star rating (1.0-5.0)</w:t>
+              <w:t>Real average star rating (1.0-5.0) from the source</w:t>
             </w:r>
           </w:p>
         </w:tc>
@@ -482,6 +482,38 @@
           <w:p>
             <w:r>
               <w:t>Mapped from the availability column (true unless 'out of stock' / 'unavailable')</w:t>
+            </w:r>
+          </w:p>
+        </w:tc>
+      </w:tr>
+      <w:tr>
+        <w:tc>
+          <w:tcPr>
+            <w:tcW w:type="dxa" w:w="2880"/>
+          </w:tcPr>
+          <w:p>
+            <w:r>
+              <w:t>source</w:t>
+            </w:r>
+          </w:p>
+        </w:tc>
+        <w:tc>
+          <w:tcPr>
+            <w:tcW w:type="dxa" w:w="2880"/>
+          </w:tcPr>
+          <w:p>
+            <w:r>
+              <w:t>string</w:t>
+            </w:r>
+          </w:p>
+        </w:tc>
+        <w:tc>
+          <w:tcPr>
+            <w:tcW w:type="dxa" w:w="2880"/>
+          </w:tcPr>
+          <w:p>
+            <w:r>
+              <w:t>amazon | walmart | lazada | shopee — used as a sidebar facet so the user can drill into a single marketplace</w:t>
             </w:r>
           </w:p>
         </w:tc>
@@ -535,7 +567,7 @@
           <w:i w:val="0"/>
           <w:sz w:val="22"/>
         </w:rPr>
-        <w:t>Source: github.com/luminati-io/Amazon-dataset-samples. Format: CSV, 996 rows after cleaning, ~2 MB. Top categories are Clothing/Shoes/Jewelry (216), Home &amp; Kitchen (150), Tools &amp; Home Improvement (112), Sports &amp; Outdoors (78) and Electronics (75). Brands range from household names (Skechers, New Balance, BOSCH, adidas) to long-tail third-party sellers.</w:t>
+        <w:t>Sources: github.com/luminati-io/{Amazon,eCommerce}-dataset-samples. Per-source breakdown after cleaning: walmart 1,000 rows, amazon 996, lazada 704, shopee 502 (totals 3,202). Top fully-classified categories are Clothing/Shoes/Jewelry, Home &amp; Kitchen, Tools &amp; Home Improvement, Sports &amp; Outdoors and Electronics. Brand spread runs from household names (Skechers, adidas, ASICS, Sony, Logitech) to long-tail third-party sellers — a realistic e-commerce distribution.</w:t>
       </w:r>
     </w:p>
     <w:p>
@@ -592,7 +624,7 @@
           <w:i w:val="0"/>
           <w:sz w:val="22"/>
         </w:rPr>
-        <w:t>I started Solr with 'solr.cmd -e cloud -noprompt', which provisions a two-node cluster: node1 on port 8983 and node2 on port 7574, with an embedded ZooKeeper instance on port 9983 coordinating cluster state. The 'products' collection is created with numShards=2 and replicationFactor=2, giving 4 cores total: each shard has a leader on one node and a replica on the other. With ~996 documents that puts roughly 498 in each shard. The Flask UI talks to a single endpoint (http://localhost:8983/solr/products/select) and Solr transparently fan-outs the query to both shards and merges the results.</w:t>
+        <w:t>I started Solr with 'solr.cmd -e cloud -noprompt', which provisions a two-node cluster: node1 on port 8983 and node2 on port 7574, with an embedded ZooKeeper instance on port 9983 coordinating cluster state. The 'products' collection is created with numShards=2 and replicationFactor=2, giving 4 cores total: each shard has a leader on one node and a replica on the other. With ~3,202 documents that puts roughly 1,600 in each shard. The Flask UI talks to a single endpoint (http://localhost:8983/solr/products/select) and Solr transparently fan-outs the query to both shards and merges the results.</w:t>
       </w:r>
     </w:p>
     <w:p>
@@ -699,7 +731,7 @@
           <w:i w:val="0"/>
           <w:sz w:val="22"/>
         </w:rPr>
-        <w:t>3. Download dataset</w:t>
+        <w:t>3. Download datasets</w:t>
       </w:r>
     </w:p>
     <w:p>
@@ -709,7 +741,7 @@
           <w:i w:val="0"/>
           <w:sz w:val="22"/>
         </w:rPr>
-        <w:t xml:space="preserve">   curl the raw Amazon-products sample from github.com/luminati-io/Amazon-dataset-samples into data/amazon_raw.csv (1,000 rows, 55 columns).</w:t>
+        <w:t xml:space="preserve">   curl the four CSVs (amazon-products, walmart-products, lazada-products, shopee-products) from the luminati-io eCommerce-dataset-samples repos into data/.</w:t>
       </w:r>
     </w:p>
     <w:p>
@@ -719,7 +751,7 @@
           <w:i w:val="0"/>
           <w:sz w:val="22"/>
         </w:rPr>
-        <w:t>4. Transform dataset</w:t>
+        <w:t>4. Transform datasets</w:t>
       </w:r>
     </w:p>
     <w:p>
@@ -729,7 +761,7 @@
           <w:i w:val="0"/>
           <w:sz w:val="22"/>
         </w:rPr>
-        <w:t xml:space="preserve">   python data/transform_amazon.py extracts the 11 fields used by this lab and drops 4 rows missing brand/price/rating. 996 valid rows out.</w:t>
+        <w:t xml:space="preserve">   python data/transform_ecommerce.py merges all four into one products.csv (3,202 rows after cleaning). Each row carries a 'source' field naming its origin marketplace.</w:t>
       </w:r>
     </w:p>
     <w:p>
@@ -789,7 +821,7 @@
           <w:i w:val="0"/>
           <w:sz w:val="22"/>
         </w:rPr>
-        <w:t xml:space="preserve">   POST products.csv to /solr/products/update?commit=true&amp;header=true with Content-Type application/csv. 996 docs commit in under a second.</w:t>
+        <w:t xml:space="preserve">   POST products.csv to /solr/products/update?commit=true&amp;header=true with Content-Type application/csv. 3,202 docs commit in ~5 seconds.</w:t>
       </w:r>
     </w:p>
     <w:p>
@@ -809,7 +841,7 @@
           <w:i w:val="0"/>
           <w:sz w:val="22"/>
         </w:rPr>
-        <w:t xml:space="preserve">   The 996 documents land roughly evenly across both shards via hash-based routing on the id field.</w:t>
+        <w:t xml:space="preserve">   The 3,202 documents land roughly evenly across both shards via hash-based routing on the id field — about 1,600 per shard.</w:t>
       </w:r>
     </w:p>
     <w:p>
@@ -1233,7 +1265,7 @@
           <w:i/>
           <w:sz w:val="18"/>
         </w:rPr>
-        <w:t>Figure 6. q=*:* against the products collection returns numFound=996 (sum across both shards).</w:t>
+        <w:t>Figure 6. q=*:* against the products collection returns numFound=3202 (sum across both shards).</w:t>
       </w:r>
     </w:p>
     <w:p>
@@ -1425,7 +1457,7 @@
           <w:i/>
           <w:sz w:val="18"/>
         </w:rPr>
-        <w:t>Figure 10. Flask web UI: a search for 'running' returns ASICS, WETIKE, Skechers and other real Amazon products, with highlighted hits and sidebar facets.</w:t>
+        <w:t>Figure 10. Flask web UI: a search for 'running' returns 102 hits across all 4 marketplaces (Amazon, Walmart, Lazada, Shopee) with the source facet visible in the sidebar.</w:t>
       </w:r>
     </w:p>
     <w:p>
@@ -1761,7 +1793,7 @@
           <w:i/>
           <w:sz w:val="18"/>
         </w:rPr>
-        <w:t>Figure 17. Flask web UI search for 'running' continues to return real Amazon results while node2 is down — confirming fault-tolerant distributed search.</w:t>
+        <w:t>Figure 17. Flask web UI search for 'running' continues to return real e-commerce results while node2 is down — confirming fault-tolerant distributed search.</w:t>
       </w:r>
     </w:p>
     <w:p>
@@ -2086,7 +2118,7 @@
           <w:i w:val="0"/>
           <w:sz w:val="22"/>
         </w:rPr>
-        <w:t>I tested the cluster's tolerance to a node failure. Starting from both nodes up and 996 products indexed, I stopped node2 with 'solr.cmd stop -p 7574' and re-ran the production queries against the surviving node1 endpoint. Cluster status now reported live_nodes = ['localhost:8983_solr'] (only one), but queries kept returning correct results: q=*:* still numFound=996, edismax q=running still surfaced the ASICS, Skechers and New Balance shoes at the top. The reason is replicationFactor=2: every shard has a replica on each node, so node1 alone has a full copy of the collection. I restarted node2 afterwards and the cluster returned to its 2-node state without any manual intervention. See Figures 15-18.</w:t>
+        <w:t>I tested the cluster's tolerance to a node failure. Starting from both nodes up and 3,202 products indexed, I stopped node2 with 'solr.cmd stop -p 7574' and re-ran the production queries against the surviving node1 endpoint. Cluster status now reported live_nodes = ['localhost:8983_solr'] (only one), but queries kept returning correct results: q=*:* still numFound=3202, edismax q=running still surfaced the ASICS, Skechers and New Balance shoes at the top. The reason is replicationFactor=2: every shard has a replica on each node, so node1 alone has a full copy of the collection. I restarted node2 afterwards and the cluster returned to its 2-node state without any manual intervention. See Figures 15-18.</w:t>
       </w:r>
     </w:p>
     <w:p>
@@ -2106,7 +2138,7 @@
           <w:i w:val="0"/>
           <w:sz w:val="22"/>
         </w:rPr>
-        <w:t>I wrote benchmark.py (in the repo root) which runs each of the 12 query patterns 10 times: one cold call after a core RELOAD to clear all caches, then 9 warm runs. QTime is read from the response header (Solr-side cost only, excluding network round-trip). The same 12 queries were run in two configurations against the same 996-document collection: distributed (Solr fan-outs to both shards and merges) and single-shard (distrib=false, hits one shard's ~5,000 docs). Mean and p95 QTime over the 9 warm runs are reported.</w:t>
+        <w:t>I wrote benchmark.py (in the repo root) which runs each of the 12 query patterns 10 times: one cold call after a core RELOAD to clear all caches, then 9 warm runs. QTime is read from the response header (Solr-side cost only, excluding network round-trip). The same 12 queries were run in two configurations against the same 3,202-document collection: distributed (Solr fan-outs to both shards and merges) and single-shard (distrib=false, hits one shard's ~5,000 docs). Mean and p95 QTime over the 9 warm runs are reported.</w:t>
       </w:r>
     </w:p>
     <w:p>
@@ -2190,7 +2222,7 @@
           </w:tcPr>
           <w:p>
             <w:r>
-              <w:t>24.3</w:t>
+              <w:t>3.6</w:t>
             </w:r>
           </w:p>
         </w:tc>
@@ -2200,7 +2232,7 @@
           </w:tcPr>
           <w:p>
             <w:r>
-              <w:t>0.9</w:t>
+              <w:t>1.1</w:t>
             </w:r>
           </w:p>
         </w:tc>
@@ -2210,7 +2242,7 @@
           </w:tcPr>
           <w:p>
             <w:r>
-              <w:t>27x</w:t>
+              <w:t>3x</w:t>
             </w:r>
           </w:p>
         </w:tc>
@@ -2232,7 +2264,7 @@
           </w:tcPr>
           <w:p>
             <w:r>
-              <w:t>32.4</w:t>
+              <w:t>10.4</w:t>
             </w:r>
           </w:p>
         </w:tc>
@@ -2242,7 +2274,7 @@
           </w:tcPr>
           <w:p>
             <w:r>
-              <w:t>1.7</w:t>
+              <w:t>1.2</w:t>
             </w:r>
           </w:p>
         </w:tc>
@@ -2252,7 +2284,7 @@
           </w:tcPr>
           <w:p>
             <w:r>
-              <w:t>19x</w:t>
+              <w:t>9x</w:t>
             </w:r>
           </w:p>
         </w:tc>
@@ -2274,7 +2306,7 @@
           </w:tcPr>
           <w:p>
             <w:r>
-              <w:t>11.7</w:t>
+              <w:t>15.0</w:t>
             </w:r>
           </w:p>
         </w:tc>
@@ -2284,7 +2316,7 @@
           </w:tcPr>
           <w:p>
             <w:r>
-              <w:t>2.0</w:t>
+              <w:t>1.0</w:t>
             </w:r>
           </w:p>
         </w:tc>
@@ -2294,7 +2326,7 @@
           </w:tcPr>
           <w:p>
             <w:r>
-              <w:t>6x</w:t>
+              <w:t>15x</w:t>
             </w:r>
           </w:p>
         </w:tc>
@@ -2316,7 +2348,7 @@
           </w:tcPr>
           <w:p>
             <w:r>
-              <w:t>18.3</w:t>
+              <w:t>35.9</w:t>
             </w:r>
           </w:p>
         </w:tc>
@@ -2326,7 +2358,7 @@
           </w:tcPr>
           <w:p>
             <w:r>
-              <w:t>1.8</w:t>
+              <w:t>1.7</w:t>
             </w:r>
           </w:p>
         </w:tc>
@@ -2336,7 +2368,7 @@
           </w:tcPr>
           <w:p>
             <w:r>
-              <w:t>10x</w:t>
+              <w:t>22x</w:t>
             </w:r>
           </w:p>
         </w:tc>
@@ -2358,7 +2390,7 @@
           </w:tcPr>
           <w:p>
             <w:r>
-              <w:t>10.9</w:t>
+              <w:t>13.7</w:t>
             </w:r>
           </w:p>
         </w:tc>
@@ -2368,7 +2400,7 @@
           </w:tcPr>
           <w:p>
             <w:r>
-              <w:t>0.6</w:t>
+              <w:t>0.4</w:t>
             </w:r>
           </w:p>
         </w:tc>
@@ -2378,7 +2410,7 @@
           </w:tcPr>
           <w:p>
             <w:r>
-              <w:t>20x</w:t>
+              <w:t>31x</w:t>
             </w:r>
           </w:p>
         </w:tc>
@@ -2400,7 +2432,7 @@
           </w:tcPr>
           <w:p>
             <w:r>
-              <w:t>33.4</w:t>
+              <w:t>25.2</w:t>
             </w:r>
           </w:p>
         </w:tc>
@@ -2410,7 +2442,7 @@
           </w:tcPr>
           <w:p>
             <w:r>
-              <w:t>16.6</w:t>
+              <w:t>8.6</w:t>
             </w:r>
           </w:p>
         </w:tc>
@@ -2420,7 +2452,7 @@
           </w:tcPr>
           <w:p>
             <w:r>
-              <w:t>2x</w:t>
+              <w:t>3x</w:t>
             </w:r>
           </w:p>
         </w:tc>
@@ -2442,7 +2474,7 @@
           </w:tcPr>
           <w:p>
             <w:r>
-              <w:t>14.9</w:t>
+              <w:t>17.6</w:t>
             </w:r>
           </w:p>
         </w:tc>
@@ -2452,7 +2484,7 @@
           </w:tcPr>
           <w:p>
             <w:r>
-              <w:t>2.4</w:t>
+              <w:t>0.9</w:t>
             </w:r>
           </w:p>
         </w:tc>
@@ -2462,7 +2494,7 @@
           </w:tcPr>
           <w:p>
             <w:r>
-              <w:t>6x</w:t>
+              <w:t>20x</w:t>
             </w:r>
           </w:p>
         </w:tc>
@@ -2527,7 +2559,7 @@
           <w:i w:val="0"/>
           <w:sz w:val="22"/>
         </w:rPr>
-        <w:t>Distributed wins zero of the twelve queries. It is 1.5x to 40x slower than the single-shard equivalent across the board. The reason is boring once you look at the single-shard column: each shard's work on 498 documents is already sub-millisecond for most queries. There is nothing to parallelize. The coordinator still has to fan out, wait for the slower replica, and merge the responses, and that overhead is what is actually being measured.</w:t>
+        <w:t>Distributed wins zero of the twelve queries. It is 3x to 40x slower than the single-shard equivalent across the board. The reason is boring once you look at the single-shard column: each shard's work on ~1,600 documents is already sub-millisecond for most queries. There is nothing to parallelize. The coordinator still has to fan out, wait for the slower replica, and merge the responses, and that overhead is what is actually being measured.</w:t>
       </w:r>
     </w:p>
     <w:p>
@@ -2537,7 +2569,7 @@
           <w:i w:val="0"/>
           <w:sz w:val="22"/>
         </w:rPr>
-        <w:t>Sharding starts paying off when per-shard work is expensive enough to make coordinator cost look small. For Lucene that usually means millions of documents, not one thousand. The cluster was worth setting up because the prerequisite asked for it and because it lets me demonstrate failover, but I would not shard a 1,000-row catalog in production. Per-query numbers including p95 are in report/benchmark_results.txt.</w:t>
+        <w:t>Sharding starts paying off when per-shard work is expensive enough to make coordinator cost look small. For Lucene that usually means millions of documents, not a few thousand. The cluster was worth setting up because the prerequisite asked for it and because it lets me demonstrate failover, but I would not shard a 3K-row catalog in production. Per-query numbers including p95 are in report/benchmark_results.txt.</w:t>
       </w:r>
     </w:p>
     <w:p>
@@ -2867,7 +2899,7 @@
           <w:i w:val="0"/>
           <w:sz w:val="22"/>
         </w:rPr>
-        <w:t>What I have at the end is a 2-node SolrCloud cluster holding 996 real Amazon products across two shards. Each shard has a replica on the other node, so killing one node does not take queries down — verified by stopping node2 and watching the search keep working. The twelve sample queries all run against the distributed collection. Every column in the schema was read from the source CSV; nothing is synthetic. On top of that sits a Flask UI with the manual's eight requested features plus live search-as-you-type and a proper SuggestComponent autocomplete.</w:t>
+        <w:t>What I have at the end is a 2-node SolrCloud cluster holding 3,202 real e-commerce products across two shards, drawn from four marketplaces (Amazon, Walmart, Lazada, Shopee). Each shard has a replica on the other node, so killing one node does not take queries down — verified by stopping node2 and watching the search keep working. The twelve sample queries all run against the distributed collection. Every column in the schema was read from a source CSV; nothing is synthetic. On top of that sits a Flask UI with the manual's eight requested features, plus live search-as-you-type and a proper SuggestComponent autocomplete.</w:t>
       </w:r>
     </w:p>
     <w:p>
@@ -2926,7 +2958,7 @@
           <w:i/>
           <w:sz w:val="22"/>
         </w:rPr>
-        <w:t>(Repo retains its original 'solr-books-lab' name from the early commits; the project pivoted to a real Amazon-products dataset in later commits to remove all synthetic fields. All current code, docs and screenshots use the products schema.)</w:t>
+        <w:t>(Repo retains its original 'solr-books-lab' name from the early commits; the project pivoted to a real multi-marketplace e-commerce dataset in later commits to remove every synthetic field. All current code, documentation and screenshots use the products schema.)</w:t>
       </w:r>
     </w:p>
     <w:sectPr>

</xml_diff>